<commit_message>
FAI Pohl: fichas adaptadas al montaje del laboratorio (freno por AC rectificada, V_B 4/6/8 V, motor DC 0,65 A)
Co-Authored-By: Claude Opus 5.5 <noreply@anthropic.com>
Claude-Session: https://claude.ai/code/session_01GdrGkTkQ1SpY6BWmf3EBwF
</commit_message>
<xml_diff>
--- a/fichas/fai-pohl-amortiguadas.docx
+++ b/fichas/fai-pohl-amortiguadas.docx
@@ -41,7 +41,7 @@
         <w:jc w:val="both"/>
       </w:pPr>
       <w:r>
-        <w:t xml:space="preserve">Medir el periodo propio del péndulo de torsión de Pohl y estudiar sus oscilaciones amortiguadas: obtener el decremento logarítmico, el ritmo de amortiguamiento y el factor de calidad para distintas corrientes del freno, y comprobar cómo depende el amortiguamiento de la corriente.</w:t>
+        <w:t xml:space="preserve">Medir el periodo propio del péndulo de torsión de Pohl y estudiar sus oscilaciones amortiguadas: obtener el ritmo de amortiguamiento, el decremento logarítmico y el factor de calidad para distintas tensiones del freno, y comprobar cómo depende el amortiguamiento de la corriente del freno.</w:t>
       </w:r>
     </w:p>
     <w:bookmarkEnd w:id="21"/>
@@ -361,7 +361,7 @@
         </m:sSub>
       </m:oMath>
       <w:r>
-        <w:t xml:space="preserve">), la solución es una oscilación de amplitud decreciente,</w:t>
+        <w:t xml:space="preserve">, oscilación subamortiguada, que es nuestro caso), la solución es una oscilación de amplitud decreciente,</w:t>
       </w:r>
     </w:p>
     <w:p>
@@ -396,9 +396,18 @@
             </m:rPr>
             <m:t>=</m:t>
           </m:r>
-          <m:r>
-            <m:t>A</m:t>
-          </m:r>
+          <m:sSub>
+            <m:e>
+              <m:r>
+                <m:t>φ</m:t>
+              </m:r>
+            </m:e>
+            <m:sub>
+              <m:r>
+                <m:t>0</m:t>
+              </m:r>
+            </m:sub>
+          </m:sSub>
           <m:r>
             <m:t> </m:t>
           </m:r>
@@ -438,31 +447,12 @@
             </m:rPr>
             <m:t>cos</m:t>
           </m:r>
-          <m:d>
-            <m:dPr>
-              <m:begChr m:val="("/>
-              <m:endChr m:val=")"/>
-              <m:sepChr m:val=""/>
-              <m:grow/>
-            </m:dPr>
-            <m:e>
-              <m:r>
-                <m:t>ω</m:t>
-              </m:r>
-              <m:r>
-                <m:t>t</m:t>
-              </m:r>
-              <m:r>
-                <m:rPr>
-                  <m:sty m:val="p"/>
-                </m:rPr>
-                <m:t>+</m:t>
-              </m:r>
-              <m:r>
-                <m:t>ϕ</m:t>
-              </m:r>
-            </m:e>
-          </m:d>
+          <m:r>
+            <m:t>ω</m:t>
+          </m:r>
+          <m:r>
+            <m:t>t</m:t>
+          </m:r>
           <m:r>
             <m:rPr>
               <m:sty m:val="p"/>
@@ -587,112 +577,46 @@
         <w:jc w:val="both"/>
       </w:pPr>
       <w:r>
-        <w:t xml:space="preserve">Los máximos sucesivos en un mismo lado están separados un periodo</w:t>
+        <w:t xml:space="preserve">En los extremos de la oscilación, que se suceden cada medio periodo alternando de lado,</w:t>
       </w:r>
       <w:r>
         <w:t xml:space="preserve"> </w:t>
       </w:r>
       <m:oMath>
-        <m:r>
-          <m:t>T</m:t>
-        </m:r>
-      </m:oMath>
-      <w:r>
-        <w:t xml:space="preserve">, así que la amplitud del máximo</w:t>
-      </w:r>
-      <w:r>
-        <w:t xml:space="preserve"> </w:t>
-      </w:r>
-      <m:oMath>
-        <m:r>
-          <m:t>n</m:t>
-        </m:r>
-      </m:oMath>
-      <w:r>
-        <w:t xml:space="preserve"> </w:t>
-      </w:r>
-      <w:r>
-        <w:t xml:space="preserve">es</w:t>
-      </w:r>
-      <w:r>
-        <w:t xml:space="preserve"> </w:t>
-      </w:r>
-      <m:oMath>
-        <m:sSub>
+        <m:d>
+          <m:dPr>
+            <m:begChr m:val="|"/>
+            <m:endChr m:val="|"/>
+            <m:sepChr m:val=""/>
+            <m:grow/>
+          </m:dPr>
           <m:e>
             <m:r>
-              <m:t>A</m:t>
+              <m:rPr>
+                <m:sty m:val="p"/>
+              </m:rPr>
+              <m:t>cos</m:t>
+            </m:r>
+            <m:r>
+              <m:t>ω</m:t>
+            </m:r>
+            <m:r>
+              <m:t>t</m:t>
             </m:r>
           </m:e>
-          <m:sub>
-            <m:r>
-              <m:t>n</m:t>
-            </m:r>
-          </m:sub>
-        </m:sSub>
+        </m:d>
         <m:r>
           <m:rPr>
             <m:sty m:val="p"/>
           </m:rPr>
           <m:t>=</m:t>
         </m:r>
-        <m:sSub>
-          <m:e>
-            <m:r>
-              <m:t>A</m:t>
-            </m:r>
-          </m:e>
-          <m:sub>
-            <m:r>
-              <m:t>0</m:t>
-            </m:r>
-          </m:sub>
-        </m:sSub>
-        <m:r>
-          <m:t> </m:t>
-        </m:r>
-        <m:sSup>
-          <m:e>
-            <m:r>
-              <m:t>e</m:t>
-            </m:r>
-          </m:e>
-          <m:sup>
-            <m:r>
-              <m:rPr>
-                <m:sty m:val="p"/>
-              </m:rPr>
-              <m:t>−</m:t>
-            </m:r>
-            <m:r>
-              <m:t>n</m:t>
-            </m:r>
-            <m:r>
-              <m:t> </m:t>
-            </m:r>
-            <m:r>
-              <m:t>γ</m:t>
-            </m:r>
-            <m:r>
-              <m:t>T</m:t>
-            </m:r>
-            <m:r>
-              <m:rPr>
-                <m:sty m:val="p"/>
-              </m:rPr>
-              <m:t>/</m:t>
-            </m:r>
-            <m:r>
-              <m:t>2</m:t>
-            </m:r>
-          </m:sup>
-        </m:sSup>
+        <m:r>
+          <m:t>1</m:t>
+        </m:r>
       </m:oMath>
       <w:r>
-        <w:t xml:space="preserve"> </w:t>
-      </w:r>
-      <w:r>
-        <w:t xml:space="preserve">y</w:t>
+        <w:t xml:space="preserve">, así que</w:t>
       </w:r>
     </w:p>
     <w:p>
@@ -711,18 +635,32 @@
             </m:rPr>
             <m:t>ln</m:t>
           </m:r>
-          <m:sSub>
+          <m:d>
+            <m:dPr>
+              <m:begChr m:val="|"/>
+              <m:endChr m:val="|"/>
+              <m:sepChr m:val=""/>
+              <m:grow/>
+            </m:dPr>
             <m:e>
               <m:r>
-                <m:t>A</m:t>
+                <m:t>φ</m:t>
               </m:r>
+              <m:d>
+                <m:dPr>
+                  <m:begChr m:val="("/>
+                  <m:endChr m:val=")"/>
+                  <m:sepChr m:val=""/>
+                  <m:grow/>
+                </m:dPr>
+                <m:e>
+                  <m:r>
+                    <m:t>t</m:t>
+                  </m:r>
+                </m:e>
+              </m:d>
             </m:e>
-            <m:sub>
-              <m:r>
-                <m:t>n</m:t>
-              </m:r>
-            </m:sub>
-          </m:sSub>
+          </m:d>
           <m:r>
             <m:rPr>
               <m:sty m:val="p"/>
@@ -738,7 +676,7 @@
           <m:sSub>
             <m:e>
               <m:r>
-                <m:t>A</m:t>
+                <m:t>φ</m:t>
               </m:r>
             </m:e>
             <m:sub>
@@ -753,87 +691,6 @@
             </m:rPr>
             <m:t>−</m:t>
           </m:r>
-          <m:r>
-            <m:t>δ</m:t>
-          </m:r>
-          <m:r>
-            <m:t> </m:t>
-          </m:r>
-          <m:r>
-            <m:t>n</m:t>
-          </m:r>
-          <m:r>
-            <m:rPr>
-              <m:sty m:val="p"/>
-            </m:rPr>
-            <m:t>,</m:t>
-          </m:r>
-          <m:r>
-            <m:t>  </m:t>
-          </m:r>
-          <m:r>
-            <m:t>δ</m:t>
-          </m:r>
-          <m:r>
-            <m:rPr>
-              <m:sty m:val="p"/>
-            </m:rPr>
-            <m:t>=</m:t>
-          </m:r>
-          <m:r>
-            <m:rPr>
-              <m:sty m:val="p"/>
-            </m:rPr>
-            <m:t>ln</m:t>
-          </m:r>
-          <m:f>
-            <m:fPr>
-              <m:type m:val="bar"/>
-            </m:fPr>
-            <m:num>
-              <m:sSub>
-                <m:e>
-                  <m:r>
-                    <m:t>A</m:t>
-                  </m:r>
-                </m:e>
-                <m:sub>
-                  <m:r>
-                    <m:t>n</m:t>
-                  </m:r>
-                </m:sub>
-              </m:sSub>
-            </m:num>
-            <m:den>
-              <m:sSub>
-                <m:e>
-                  <m:r>
-                    <m:t>A</m:t>
-                  </m:r>
-                </m:e>
-                <m:sub>
-                  <m:r>
-                    <m:t>n</m:t>
-                  </m:r>
-                  <m:r>
-                    <m:rPr>
-                      <m:sty m:val="p"/>
-                    </m:rPr>
-                    <m:t>+</m:t>
-                  </m:r>
-                  <m:r>
-                    <m:t>1</m:t>
-                  </m:r>
-                </m:sub>
-              </m:sSub>
-            </m:den>
-          </m:f>
-          <m:r>
-            <m:rPr>
-              <m:sty m:val="p"/>
-            </m:rPr>
-            <m:t>=</m:t>
-          </m:r>
           <m:f>
             <m:fPr>
               <m:type m:val="bar"/>
@@ -841,9 +698,6 @@
             <m:num>
               <m:r>
                 <m:t>γ</m:t>
-              </m:r>
-              <m:r>
-                <m:t>T</m:t>
               </m:r>
             </m:num>
             <m:den>
@@ -853,10 +707,16 @@
             </m:den>
           </m:f>
           <m:r>
+            <m:t> </m:t>
+          </m:r>
+          <m:r>
+            <m:t>t</m:t>
+          </m:r>
+          <m:r>
             <m:rPr>
               <m:sty m:val="p"/>
             </m:rPr>
-            <m:t>,</m:t>
+            <m:t>.</m:t>
           </m:r>
         </m:oMath>
       </m:oMathPara>
@@ -867,21 +727,158 @@
         <w:jc w:val="both"/>
       </w:pPr>
       <w:r>
-        <w:t xml:space="preserve">donde</w:t>
+        <w:t xml:space="preserve">La razón entre dos amplitudes separadas un periodo es la</w:t>
+      </w:r>
+      <w:r>
+        <w:t xml:space="preserve"> </w:t>
+      </w:r>
+      <w:r>
+        <w:rPr>
+          <w:bCs/>
+          <w:b/>
+        </w:rPr>
+        <w:t xml:space="preserve">razón de amortiguamiento</w:t>
       </w:r>
       <w:r>
         <w:t xml:space="preserve"> </w:t>
       </w:r>
       <m:oMath>
         <m:r>
+          <m:t>K</m:t>
+        </m:r>
+        <m:r>
+          <m:rPr>
+            <m:sty m:val="p"/>
+          </m:rPr>
+          <m:t>=</m:t>
+        </m:r>
+        <m:r>
+          <m:t>φ</m:t>
+        </m:r>
+        <m:d>
+          <m:dPr>
+            <m:begChr m:val="("/>
+            <m:endChr m:val=")"/>
+            <m:sepChr m:val=""/>
+            <m:grow/>
+          </m:dPr>
+          <m:e>
+            <m:r>
+              <m:t>t</m:t>
+            </m:r>
+          </m:e>
+        </m:d>
+        <m:r>
+          <m:rPr>
+            <m:sty m:val="p"/>
+          </m:rPr>
+          <m:t>/</m:t>
+        </m:r>
+        <m:r>
+          <m:t>φ</m:t>
+        </m:r>
+        <m:d>
+          <m:dPr>
+            <m:begChr m:val="("/>
+            <m:endChr m:val=")"/>
+            <m:sepChr m:val=""/>
+            <m:grow/>
+          </m:dPr>
+          <m:e>
+            <m:r>
+              <m:t>t</m:t>
+            </m:r>
+            <m:r>
+              <m:rPr>
+                <m:sty m:val="p"/>
+              </m:rPr>
+              <m:t>+</m:t>
+            </m:r>
+            <m:r>
+              <m:t>T</m:t>
+            </m:r>
+          </m:e>
+        </m:d>
+        <m:r>
+          <m:rPr>
+            <m:sty m:val="p"/>
+          </m:rPr>
+          <m:t>=</m:t>
+        </m:r>
+        <m:sSup>
+          <m:e>
+            <m:r>
+              <m:t>e</m:t>
+            </m:r>
+          </m:e>
+          <m:sup>
+            <m:r>
+              <m:t>γ</m:t>
+            </m:r>
+            <m:r>
+              <m:t>T</m:t>
+            </m:r>
+            <m:r>
+              <m:rPr>
+                <m:sty m:val="p"/>
+              </m:rPr>
+              <m:t>/</m:t>
+            </m:r>
+            <m:r>
+              <m:t>2</m:t>
+            </m:r>
+          </m:sup>
+        </m:sSup>
+      </m:oMath>
+      <w:r>
+        <w:t xml:space="preserve">, y su logaritmo,</w:t>
+      </w:r>
+      <w:r>
+        <w:t xml:space="preserve"> </w:t>
+      </w:r>
+      <m:oMath>
+        <m:r>
           <m:t>δ</m:t>
         </m:r>
+        <m:r>
+          <m:rPr>
+            <m:sty m:val="p"/>
+          </m:rPr>
+          <m:t>=</m:t>
+        </m:r>
+        <m:r>
+          <m:rPr>
+            <m:sty m:val="p"/>
+          </m:rPr>
+          <m:t>ln</m:t>
+        </m:r>
+        <m:r>
+          <m:t>K</m:t>
+        </m:r>
+        <m:r>
+          <m:rPr>
+            <m:sty m:val="p"/>
+          </m:rPr>
+          <m:t>=</m:t>
+        </m:r>
+        <m:r>
+          <m:t>γ</m:t>
+        </m:r>
+        <m:r>
+          <m:t>T</m:t>
+        </m:r>
+        <m:r>
+          <m:rPr>
+            <m:sty m:val="p"/>
+          </m:rPr>
+          <m:t>/</m:t>
+        </m:r>
+        <m:r>
+          <m:t>2</m:t>
+        </m:r>
       </m:oMath>
       <w:r>
-        <w:t xml:space="preserve"> </w:t>
-      </w:r>
-      <w:r>
-        <w:t xml:space="preserve">es el</w:t>
+        <w:t xml:space="preserve">, el</w:t>
       </w:r>
       <w:r>
         <w:t xml:space="preserve"> </w:t>
@@ -894,33 +891,33 @@
         <w:t xml:space="preserve">decremento logarítmico</w:t>
       </w:r>
       <w:r>
-        <w:t xml:space="preserve">. El tiempo característico de la amplitud es</w:t>
+        <w:t xml:space="preserve">. El factor de calidad es</w:t>
       </w:r>
       <w:r>
         <w:t xml:space="preserve"> </w:t>
       </w:r>
       <m:oMath>
-        <m:sSub>
-          <m:e>
-            <m:r>
-              <m:t>τ</m:t>
-            </m:r>
-          </m:e>
-          <m:sub>
-            <m:r>
-              <m:t>A</m:t>
-            </m:r>
-          </m:sub>
-        </m:sSub>
+        <m:r>
+          <m:t>Q</m:t>
+        </m:r>
         <m:r>
           <m:rPr>
             <m:sty m:val="p"/>
           </m:rPr>
           <m:t>=</m:t>
         </m:r>
-        <m:r>
-          <m:t>2</m:t>
-        </m:r>
+        <m:sSub>
+          <m:e>
+            <m:r>
+              <m:t>ω</m:t>
+            </m:r>
+          </m:e>
+          <m:sub>
+            <m:r>
+              <m:t>0</m:t>
+            </m:r>
+          </m:sub>
+        </m:sSub>
         <m:r>
           <m:rPr>
             <m:sty m:val="p"/>
@@ -930,38 +927,15 @@
         <m:r>
           <m:t>γ</m:t>
         </m:r>
-      </m:oMath>
-      <w:r>
-        <w:t xml:space="preserve"> </w:t>
-      </w:r>
-      <w:r>
-        <w:t xml:space="preserve">y el factor de calidad</w:t>
-      </w:r>
-      <w:r>
-        <w:t xml:space="preserve"> </w:t>
-      </w:r>
-      <m:oMath>
-        <m:r>
-          <m:t>Q</m:t>
-        </m:r>
         <m:r>
           <m:rPr>
             <m:sty m:val="p"/>
           </m:rPr>
-          <m:t>=</m:t>
-        </m:r>
-        <m:sSub>
-          <m:e>
-            <m:r>
-              <m:t>ω</m:t>
-            </m:r>
-          </m:e>
-          <m:sub>
-            <m:r>
-              <m:t>0</m:t>
-            </m:r>
-          </m:sub>
-        </m:sSub>
+          <m:t>≃</m:t>
+        </m:r>
+        <m:r>
+          <m:t>π</m:t>
+        </m:r>
         <m:r>
           <m:rPr>
             <m:sty m:val="p"/>
@@ -969,24 +943,6 @@
           <m:t>/</m:t>
         </m:r>
         <m:r>
-          <m:t>γ</m:t>
-        </m:r>
-        <m:r>
-          <m:rPr>
-            <m:sty m:val="p"/>
-          </m:rPr>
-          <m:t>≃</m:t>
-        </m:r>
-        <m:r>
-          <m:t>π</m:t>
-        </m:r>
-        <m:r>
-          <m:rPr>
-            <m:sty m:val="p"/>
-          </m:rPr>
-          <m:t>/</m:t>
-        </m:r>
-        <m:r>
           <m:t>δ</m:t>
         </m:r>
       </m:oMath>
@@ -997,9 +953,18 @@
         <w:t xml:space="preserve"> </w:t>
       </w:r>
       <m:oMath>
-        <m:r>
-          <m:t>I</m:t>
-        </m:r>
+        <m:sSub>
+          <m:e>
+            <m:r>
+              <m:t>I</m:t>
+            </m:r>
+          </m:e>
+          <m:sub>
+            <m:r>
+              <m:t>B</m:t>
+            </m:r>
+          </m:sub>
+        </m:sSub>
       </m:oMath>
       <w:r>
         <w:t xml:space="preserve"> </w:t>
@@ -1020,25 +985,30 @@
           </m:rPr>
           <m:t>∝</m:t>
         </m:r>
-        <m:sSup>
+        <m:sSubSup>
           <m:e>
             <m:r>
               <m:t>I</m:t>
             </m:r>
           </m:e>
+          <m:sub>
+            <m:r>
+              <m:t>B</m:t>
+            </m:r>
+          </m:sub>
           <m:sup>
             <m:r>
               <m:t>2</m:t>
             </m:r>
           </m:sup>
-        </m:sSup>
+        </m:sSubSup>
       </m:oMath>
       <w:r>
         <w:t xml:space="preserve">.</w:t>
       </w:r>
     </w:p>
     <w:bookmarkEnd w:id="22"/>
-    <w:bookmarkStart w:id="26" w:name="montaje-experimental"/>
+    <w:bookmarkStart w:id="29" w:name="montaje-experimental"/>
     <w:p>
       <w:pPr>
         <w:pStyle w:val="Heading2"/>
@@ -1117,18 +1087,87 @@
         <w:jc w:val="both"/>
       </w:pPr>
       <w:r>
-        <w:t xml:space="preserve">El equipo consta de la rueda de cobre con el muelle espiral, el anillo graduado (escala), el freno de corrientes de Foucault y el motor excitador, que permanece apagado en esta práctica. El freno se alimenta con la fuente de alimentación, con un multímetro en serie como amperímetro para leer</w:t>
+        <w:t xml:space="preserve">El equipo consta de la rueda de cobre con el muelle espiral, el anillo graduado (escala), el freno de corrientes de Foucault y el motor excitador, que permanece apagado en esta práctica. El freno es un electroimán que se alimenta con corriente continua. Como la salida de continua de la fuente se reserva para el motor, el freno se alimenta desde la salida de alterna a través de un rectificador, con el amperímetro en serie para leer la corriente</w:t>
       </w:r>
       <w:r>
         <w:t xml:space="preserve"> </w:t>
       </w:r>
       <m:oMath>
-        <m:r>
-          <m:t>I</m:t>
-        </m:r>
+        <m:sSub>
+          <m:e>
+            <m:r>
+              <m:t>I</m:t>
+            </m:r>
+          </m:e>
+          <m:sub>
+            <m:r>
+              <m:t>B</m:t>
+            </m:r>
+          </m:sub>
+        </m:sSub>
       </m:oMath>
       <w:r>
-        <w:t xml:space="preserve">. La amplitud se lee en el anillo graduado, en divisiones, y el tiempo con el cronómetro digital. La lectura de los máximos es más fácil entre dos: uno lee la escala y otro anota.</w:t>
+        <w:t xml:space="preserve"> </w:t>
+      </w:r>
+      <w:r>
+        <w:t xml:space="preserve">(Figura 2). La amplitud se lee en el anillo graduado, en divisiones, y el tiempo con el cronómetro. La lectura es más fácil entre dos: uno lee la escala y otro anota.</w:t>
+      </w:r>
+    </w:p>
+    <w:p>
+      <w:pPr>
+        <w:pStyle w:val="CaptionedFigure"/>
+        <w:jc w:val="center"/>
+      </w:pPr>
+      <w:r>
+        <w:drawing>
+          <wp:inline>
+            <wp:extent cx="4319999" cy="1886896"/>
+            <wp:effectExtent b="0" l="0" r="0" t="0"/>
+            <wp:docPr descr="Figura 2. Conexiones del freno y del motor." title="" id="27" name="Picture"/>
+            <a:graphic>
+              <a:graphicData uri="http://schemas.openxmlformats.org/drawingml/2006/picture">
+                <pic:pic>
+                  <pic:nvPicPr>
+                    <pic:cNvPr descr="fig/pohlcon.png" id="28" name="Picture"/>
+                    <pic:cNvPicPr>
+                      <a:picLocks noChangeArrowheads="1" noChangeAspect="1"/>
+                    </pic:cNvPicPr>
+                  </pic:nvPicPr>
+                  <pic:blipFill>
+                    <a:blip r:embed="rId26"/>
+                    <a:stretch>
+                      <a:fillRect/>
+                    </a:stretch>
+                  </pic:blipFill>
+                  <pic:spPr bwMode="auto">
+                    <a:xfrm>
+                      <a:off x="0" y="0"/>
+                      <a:ext cx="4319999" cy="1886896"/>
+                    </a:xfrm>
+                    <a:prstGeom prst="rect">
+                      <a:avLst/>
+                    </a:prstGeom>
+                    <a:noFill/>
+                    <a:ln w="9525">
+                      <a:noFill/>
+                      <a:headEnd/>
+                      <a:tailEnd/>
+                    </a:ln>
+                  </pic:spPr>
+                </pic:pic>
+              </a:graphicData>
+            </a:graphic>
+          </wp:inline>
+        </w:drawing>
+      </w:r>
+    </w:p>
+    <w:p>
+      <w:pPr>
+        <w:pStyle w:val="ImageCaption"/>
+        <w:jc w:val="center"/>
+      </w:pPr>
+      <w:r>
+        <w:t xml:space="preserve">Figura 2. Conexiones del freno y del motor.</w:t>
       </w:r>
     </w:p>
     <w:p>
@@ -1137,6 +1176,15 @@
         <w:jc w:val="both"/>
       </w:pPr>
       <w:r>
+        <w:t xml:space="preserve">Antes de empezar, con el freno apagado, ajustar la posición de reposo de la flecha de la rueda para que coincida con el cero de la escala, girando con la mano el disco del motor. Si cuesta leer las amplitudes, reducir la desviación inicial para que la flecha se mueva más despacio.</w:t>
+      </w:r>
+    </w:p>
+    <w:p>
+      <w:pPr>
+        <w:pStyle w:val="BodyText"/>
+        <w:jc w:val="both"/>
+      </w:pPr>
+      <w:r>
         <w:rPr>
           <w:bCs/>
           <w:b/>
@@ -1147,11 +1195,11 @@
         <w:t xml:space="preserve"> </w:t>
       </w:r>
       <w:r>
-        <w:t xml:space="preserve">no supere la corriente máxima del freno indicada en el equipo.</w:t>
+        <w:t xml:space="preserve">el freno soporta como máximo 1 A. Para no superarlo, no pase de 10 V de alterna en la salida de la fuente.</w:t>
       </w:r>
     </w:p>
-    <w:bookmarkEnd w:id="26"/>
-    <w:bookmarkStart w:id="27" w:name="resultados"/>
+    <w:bookmarkEnd w:id="29"/>
+    <w:bookmarkStart w:id="30" w:name="resultados"/>
     <w:p>
       <w:pPr>
         <w:pStyle w:val="Heading2"/>
@@ -1183,12 +1231,21 @@
         <w:t xml:space="preserve"> </w:t>
       </w:r>
       <w:r>
-        <w:t xml:space="preserve">Con el freno desconectado (</w:t>
+        <w:t xml:space="preserve">Con el freno sin corriente (</w:t>
       </w:r>
       <m:oMath>
-        <m:r>
-          <m:t>I</m:t>
-        </m:r>
+        <m:sSub>
+          <m:e>
+            <m:r>
+              <m:t>I</m:t>
+            </m:r>
+          </m:e>
+          <m:sub>
+            <m:r>
+              <m:t>B</m:t>
+            </m:r>
+          </m:sub>
+        </m:sSub>
         <m:r>
           <m:rPr>
             <m:sty m:val="p"/>
@@ -1200,7 +1257,51 @@
         </m:r>
       </m:oMath>
       <w:r>
-        <w:t xml:space="preserve">), girar la rueda hasta 15 divisiones, soltarla y medir tres veces el tiempo de 10 oscilaciones.</w:t>
+        <w:t xml:space="preserve">; en realidad hay un rozamiento muy pequeño), desviar la rueda, soltarla y medir cinco veces el tiempo de 20 oscilaciones,</w:t>
+      </w:r>
+      <w:r>
+        <w:t xml:space="preserve"> </w:t>
+      </w:r>
+      <m:oMath>
+        <m:sSub>
+          <m:e>
+            <m:r>
+              <m:t>t</m:t>
+            </m:r>
+          </m:e>
+          <m:sub>
+            <m:r>
+              <m:t>20</m:t>
+            </m:r>
+          </m:sub>
+        </m:sSub>
+        <m:r>
+          <m:rPr>
+            <m:sty m:val="p"/>
+          </m:rPr>
+          <m:t>=</m:t>
+        </m:r>
+        <m:r>
+          <m:t>20</m:t>
+        </m:r>
+        <m:r>
+          <m:t> </m:t>
+        </m:r>
+        <m:sSub>
+          <m:e>
+            <m:r>
+              <m:t>T</m:t>
+            </m:r>
+          </m:e>
+          <m:sub>
+            <m:r>
+              <m:t>0</m:t>
+            </m:r>
+          </m:sub>
+        </m:sSub>
+      </m:oMath>
+      <w:r>
+        <w:t xml:space="preserve">.</w:t>
       </w:r>
     </w:p>
     <w:tbl>
@@ -1216,15 +1317,14 @@
           <w:insideV w:val="single" w:sz="6" w:color="000000"/>
         </w:tblBorders>
         <w:tblLook w:firstRow="1" w:lastRow="0" w:firstColumn="0" w:lastColumn="0" w:noHBand="0" w:noVBand="0" w:val="0020"/>
-        <w:tblCaption w:val="Tabla 1. Periodo propio."/>
+        <w:tblCaption w:val="Tabla 1. Tiempo de 20 oscilaciones."/>
       </w:tblPr>
       <w:tblGrid>
-        <w:gridCol w:w="1320"/>
-        <w:gridCol w:w="1320"/>
-        <w:gridCol w:w="1320"/>
-        <w:gridCol w:w="1320"/>
-        <w:gridCol w:w="1320"/>
-        <w:gridCol w:w="1320"/>
+        <w:gridCol w:w="1584"/>
+        <w:gridCol w:w="1584"/>
+        <w:gridCol w:w="1584"/>
+        <w:gridCol w:w="1584"/>
+        <w:gridCol w:w="1584"/>
       </w:tblGrid>
       <w:tr>
         <w:trPr>
@@ -1250,7 +1350,7 @@
                 </m:e>
                 <m:sub>
                   <m:r>
-                    <m:t>10</m:t>
+                    <m:t>20</m:t>
                   </m:r>
                   <m:r>
                     <m:rPr>
@@ -1297,7 +1397,7 @@
                 </m:e>
                 <m:sub>
                   <m:r>
-                    <m:t>10</m:t>
+                    <m:t>20</m:t>
                   </m:r>
                   <m:r>
                     <m:rPr>
@@ -1344,7 +1444,7 @@
                 </m:e>
                 <m:sub>
                   <m:r>
-                    <m:t>10</m:t>
+                    <m:t>20</m:t>
                   </m:r>
                   <m:r>
                     <m:rPr>
@@ -1386,12 +1486,21 @@
               <m:sSub>
                 <m:e>
                   <m:r>
-                    <m:t>T</m:t>
+                    <m:t>t</m:t>
                   </m:r>
                 </m:e>
                 <m:sub>
                   <m:r>
-                    <m:t>0</m:t>
+                    <m:t>20</m:t>
+                  </m:r>
+                  <m:r>
+                    <m:rPr>
+                      <m:sty m:val="p"/>
+                    </m:rPr>
+                    <m:t>,</m:t>
+                  </m:r>
+                  <m:r>
+                    <m:t>4</m:t>
                   </m:r>
                 </m:sub>
               </m:sSub>
@@ -1424,59 +1533,21 @@
               <m:sSub>
                 <m:e>
                   <m:r>
-                    <m:t>ε</m:t>
-                  </m:r>
-                </m:e>
-                <m:sub>
-                  <m:sSub>
-                    <m:e>
-                      <m:r>
-                        <m:t>T</m:t>
-                      </m:r>
-                    </m:e>
-                    <m:sub>
-                      <m:r>
-                        <m:t>0</m:t>
-                      </m:r>
-                    </m:sub>
-                  </m:sSub>
-                </m:sub>
-              </m:sSub>
-            </m:oMath>
-            <w:r>
-              <w:rPr>
-                <w:sz w:val="20"/>
-              </w:rPr>
-              <w:t xml:space="preserve"> </w:t>
-            </w:r>
-            <w:r>
-              <w:rPr>
-                <w:sz w:val="20"/>
-              </w:rPr>
-              <w:t xml:space="preserve">(s)</w:t>
-            </w:r>
-          </w:p>
-        </w:tc>
-        <w:tc>
-          <w:tcPr>
-            <w:shd w:val="clear" w:color="auto" w:fill="FFF0C1"/>
-            <w:vAlign w:val="center"/>
-          </w:tcPr>
-          <w:p>
-            <w:pPr>
-              <w:pStyle w:val="Compact"/>
-              <w:jc w:val="center"/>
-            </w:pPr>
-            <m:oMath>
-              <m:sSub>
-                <m:e>
-                  <m:r>
-                    <m:t>ω</m:t>
+                    <m:t>t</m:t>
                   </m:r>
                 </m:e>
                 <m:sub>
                   <m:r>
-                    <m:t>0</m:t>
+                    <m:t>20</m:t>
+                  </m:r>
+                  <m:r>
+                    <m:rPr>
+                      <m:sty m:val="p"/>
+                    </m:rPr>
+                    <m:t>,</m:t>
+                  </m:r>
+                  <m:r>
+                    <m:t>5</m:t>
                   </m:r>
                 </m:sub>
               </m:sSub>
@@ -1491,7 +1562,7 @@
               <w:rPr>
                 <w:sz w:val="20"/>
               </w:rPr>
-              <w:t xml:space="preserve">(rad/s)</w:t>
+              <w:t xml:space="preserve">(s)</w:t>
             </w:r>
           </w:p>
         </w:tc>
@@ -1500,23 +1571,6 @@
         <w:trPr>
           <w:trHeight w:val="425" w:hRule="atLeast"/>
         </w:trPr>
-        <w:tc>
-          <w:tcPr>
-            <w:vAlign w:val="center"/>
-          </w:tcPr>
-          <w:p>
-            <w:pPr>
-              <w:pStyle w:val="Compact"/>
-              <w:jc w:val="center"/>
-            </w:pPr>
-            <w:r>
-              <w:rPr>
-                <w:sz w:val="20"/>
-              </w:rPr>
-              <w:t xml:space="preserve"> </w:t>
-            </w:r>
-          </w:p>
-        </w:tc>
         <w:tc>
           <w:tcPr>
             <w:vAlign w:val="center"/>
@@ -1610,7 +1664,7 @@
         <w:jc w:val="center"/>
       </w:pPr>
       <w:r>
-        <w:t xml:space="preserve">Tabla 1. Periodo propio.</w:t>
+        <w:t xml:space="preserve">Tabla 1. Tiempo de 20 oscilaciones.</w:t>
       </w:r>
     </w:p>
     <w:p>
@@ -1618,6 +1672,91 @@
         <w:pStyle w:val="BodyText"/>
         <w:jc w:val="both"/>
       </w:pPr>
+      <m:oMath>
+        <m:bar>
+          <m:barPr>
+            <m:pos m:val="top"/>
+          </m:barPr>
+          <m:e>
+            <m:sSub>
+              <m:e>
+                <m:r>
+                  <m:t>t</m:t>
+                </m:r>
+              </m:e>
+              <m:sub>
+                <m:r>
+                  <m:t>20</m:t>
+                </m:r>
+              </m:sub>
+            </m:sSub>
+          </m:e>
+        </m:bar>
+      </m:oMath>
+      <w:r>
+        <w:t xml:space="preserve"> </w:t>
+      </w:r>
+      <w:r>
+        <w:t xml:space="preserve">= ( __________ ± __________ ) s</w:t>
+      </w:r>
+      <w:r>
+        <w:t xml:space="preserve"> </w:t>
+      </w:r>
+      <m:oMath>
+        <m:r>
+          <m:t>  </m:t>
+        </m:r>
+        <m:sSub>
+          <m:e>
+            <m:r>
+              <m:t>T</m:t>
+            </m:r>
+          </m:e>
+          <m:sub>
+            <m:r>
+              <m:t>0</m:t>
+            </m:r>
+          </m:sub>
+        </m:sSub>
+      </m:oMath>
+      <w:r>
+        <w:t xml:space="preserve"> </w:t>
+      </w:r>
+      <w:r>
+        <w:t xml:space="preserve">= ( __________ ± __________ ) s</w:t>
+      </w:r>
+      <w:r>
+        <w:t xml:space="preserve"> </w:t>
+      </w:r>
+      <m:oMath>
+        <m:r>
+          <m:t>  </m:t>
+        </m:r>
+        <m:sSub>
+          <m:e>
+            <m:r>
+              <m:t>ω</m:t>
+            </m:r>
+          </m:e>
+          <m:sub>
+            <m:r>
+              <m:t>0</m:t>
+            </m:r>
+          </m:sub>
+        </m:sSub>
+      </m:oMath>
+      <w:r>
+        <w:t xml:space="preserve"> </w:t>
+      </w:r>
+      <w:r>
+        <w:t xml:space="preserve">= ( __________ ± __________ ) rad/s</w:t>
+      </w:r>
+    </w:p>
+    <w:p>
+      <w:pPr>
+        <w:pStyle w:val="BodyText"/>
+        <w:jc w:val="both"/>
+      </w:pPr>
       <w:r>
         <w:rPr>
           <w:bCs/>
@@ -1629,18 +1768,7 @@
         <w:t xml:space="preserve"> </w:t>
       </w:r>
       <w:r>
-        <w:t xml:space="preserve">Para cuatro corrientes del freno (</w:t>
-      </w:r>
-      <m:oMath>
-        <m:r>
-          <m:t>I</m:t>
-        </m:r>
-      </m:oMath>
-      <w:r>
-        <w:t xml:space="preserve"> </w:t>
-      </w:r>
-      <w:r>
-        <w:t xml:space="preserve">= 0 y tres valores indicados por el profesor, por ejemplo 0,2 A, 0,4 A y 0,6 A), girar la rueda hasta 18 divisiones, soltarla y anotar las amplitudes de los máximos sucesivos en el mismo lado,</w:t>
+        <w:t xml:space="preserve">Alimentar el freno con tensiones de alterna</w:t>
       </w:r>
       <w:r>
         <w:t xml:space="preserve"> </w:t>
@@ -1649,32 +1777,163 @@
         <m:sSub>
           <m:e>
             <m:r>
-              <m:t>A</m:t>
+              <m:t>V</m:t>
             </m:r>
           </m:e>
           <m:sub>
             <m:r>
-              <m:t>n</m:t>
+              <m:t>B</m:t>
             </m:r>
           </m:sub>
         </m:sSub>
       </m:oMath>
       <w:r>
-        <w:t xml:space="preserve">, hasta que sean menores que 1 división (como mucho 10 máximos). Medir también el tiempo de 5 oscilaciones para obtener</w:t>
+        <w:t xml:space="preserve"> </w:t>
+      </w:r>
+      <w:r>
+        <w:t xml:space="preserve">= 4, 6 y 8 V y anotar la corriente</w:t>
       </w:r>
       <w:r>
         <w:t xml:space="preserve"> </w:t>
       </w:r>
       <m:oMath>
-        <m:r>
-          <m:t>T</m:t>
-        </m:r>
+        <m:sSub>
+          <m:e>
+            <m:r>
+              <m:t>I</m:t>
+            </m:r>
+          </m:e>
+          <m:sub>
+            <m:r>
+              <m:t>B</m:t>
+            </m:r>
+          </m:sub>
+        </m:sSub>
       </m:oMath>
       <w:r>
         <w:t xml:space="preserve"> </w:t>
       </w:r>
       <w:r>
-        <w:t xml:space="preserve">(con la corriente más alta, el de las oscilaciones que se vean).</w:t>
+        <w:t xml:space="preserve">en cada caso. Para cada tensión, desviar la rueda hasta unas 15 divisiones, soltarla y leer la amplitud de cada extremo, alternando a izquierda y derecha, es decir, cada medio periodo (</w:t>
+      </w:r>
+      <m:oMath>
+        <m:r>
+          <m:t>t</m:t>
+        </m:r>
+        <m:r>
+          <m:rPr>
+            <m:sty m:val="p"/>
+          </m:rPr>
+          <m:t>=</m:t>
+        </m:r>
+        <m:r>
+          <m:t>k</m:t>
+        </m:r>
+        <m:r>
+          <m:t> </m:t>
+        </m:r>
+        <m:sSub>
+          <m:e>
+            <m:r>
+              <m:t>T</m:t>
+            </m:r>
+          </m:e>
+          <m:sub>
+            <m:r>
+              <m:t>0</m:t>
+            </m:r>
+          </m:sub>
+        </m:sSub>
+        <m:r>
+          <m:rPr>
+            <m:sty m:val="p"/>
+          </m:rPr>
+          <m:t>/</m:t>
+        </m:r>
+        <m:r>
+          <m:t>2</m:t>
+        </m:r>
+      </m:oMath>
+      <w:r>
+        <w:t xml:space="preserve">), hasta 14 semiperiodos o hasta que la amplitud sea menor que 1 división.</w:t>
+      </w:r>
+    </w:p>
+    <w:p>
+      <w:pPr>
+        <w:pStyle w:val="BodyText"/>
+        <w:jc w:val="both"/>
+      </w:pPr>
+      <m:oMath>
+        <m:sSub>
+          <m:e>
+            <m:r>
+              <m:t>I</m:t>
+            </m:r>
+          </m:e>
+          <m:sub>
+            <m:r>
+              <m:t>B</m:t>
+            </m:r>
+          </m:sub>
+        </m:sSub>
+      </m:oMath>
+      <w:r>
+        <w:t xml:space="preserve"> </w:t>
+      </w:r>
+      <w:r>
+        <w:t xml:space="preserve">(4 V) = __________ A</w:t>
+      </w:r>
+      <w:r>
+        <w:t xml:space="preserve"> </w:t>
+      </w:r>
+      <m:oMath>
+        <m:r>
+          <m:t>  </m:t>
+        </m:r>
+        <m:sSub>
+          <m:e>
+            <m:r>
+              <m:t>I</m:t>
+            </m:r>
+          </m:e>
+          <m:sub>
+            <m:r>
+              <m:t>B</m:t>
+            </m:r>
+          </m:sub>
+        </m:sSub>
+      </m:oMath>
+      <w:r>
+        <w:t xml:space="preserve"> </w:t>
+      </w:r>
+      <w:r>
+        <w:t xml:space="preserve">(6 V) = __________ A</w:t>
+      </w:r>
+      <w:r>
+        <w:t xml:space="preserve"> </w:t>
+      </w:r>
+      <m:oMath>
+        <m:r>
+          <m:t>  </m:t>
+        </m:r>
+        <m:sSub>
+          <m:e>
+            <m:r>
+              <m:t>I</m:t>
+            </m:r>
+          </m:e>
+          <m:sub>
+            <m:r>
+              <m:t>B</m:t>
+            </m:r>
+          </m:sub>
+        </m:sSub>
+      </m:oMath>
+      <w:r>
+        <w:t xml:space="preserve"> </w:t>
+      </w:r>
+      <w:r>
+        <w:t xml:space="preserve">(8 V) = __________ A</w:t>
       </w:r>
     </w:p>
     <w:tbl>
@@ -1690,7 +1949,7 @@
           <w:insideV w:val="single" w:sz="6" w:color="000000"/>
         </w:tblBorders>
         <w:tblLook w:firstRow="1" w:lastRow="0" w:firstColumn="0" w:lastColumn="0" w:noHBand="0" w:noVBand="0" w:val="0020"/>
-        <w:tblCaption w:val="Tabla 2. Amplitudes de los máximos sucesivos (divisiones)."/>
+        <w:tblCaption w:val="Tabla 2. Amplitudes de los extremos sucesivos (k = 0 a 14)."/>
       </w:tblPr>
       <w:tblGrid>
         <w:gridCol w:w="1584"/>
@@ -1716,7 +1975,7 @@
             </w:pPr>
             <m:oMath>
               <m:r>
-                <m:t>n</m:t>
+                <m:t>k</m:t>
               </m:r>
             </m:oMath>
           </w:p>
@@ -1732,34 +1991,38 @@
               <w:jc w:val="center"/>
             </w:pPr>
             <m:oMath>
+              <m:r>
+                <m:t>t</m:t>
+              </m:r>
+              <m:r>
+                <m:rPr>
+                  <m:sty m:val="p"/>
+                </m:rPr>
+                <m:t>=</m:t>
+              </m:r>
+              <m:r>
+                <m:t>k</m:t>
+              </m:r>
               <m:sSub>
                 <m:e>
                   <m:r>
-                    <m:t>A</m:t>
+                    <m:t>T</m:t>
                   </m:r>
                 </m:e>
                 <m:sub>
                   <m:r>
-                    <m:t>n</m:t>
+                    <m:t>0</m:t>
                   </m:r>
                 </m:sub>
               </m:sSub>
-            </m:oMath>
-            <w:r>
-              <w:rPr>
-                <w:sz w:val="20"/>
-              </w:rPr>
-              <w:t xml:space="preserve"> </w:t>
-            </w:r>
-            <w:r>
-              <w:rPr>
-                <w:sz w:val="20"/>
-              </w:rPr>
-              <w:t xml:space="preserve">(</w:t>
-            </w:r>
-            <m:oMath>
               <m:r>
-                <m:t>I</m:t>
+                <m:rPr>
+                  <m:sty m:val="p"/>
+                </m:rPr>
+                <m:t>/</m:t>
+              </m:r>
+              <m:r>
+                <m:t>2</m:t>
               </m:r>
             </m:oMath>
             <w:r>
@@ -1772,7 +2035,7 @@
               <w:rPr>
                 <w:sz w:val="20"/>
               </w:rPr>
-              <w:t xml:space="preserve">= 0)</w:t>
+              <w:t xml:space="preserve">(s)</w:t>
             </w:r>
           </w:p>
         </w:tc>
@@ -1787,18 +2050,19 @@
               <w:jc w:val="center"/>
             </w:pPr>
             <m:oMath>
-              <m:sSub>
+              <m:d>
+                <m:dPr>
+                  <m:begChr m:val="|"/>
+                  <m:endChr m:val="|"/>
+                  <m:sepChr m:val=""/>
+                  <m:grow/>
+                </m:dPr>
                 <m:e>
                   <m:r>
-                    <m:t>A</m:t>
+                    <m:t>φ</m:t>
                   </m:r>
                 </m:e>
-                <m:sub>
-                  <m:r>
-                    <m:t>n</m:t>
-                  </m:r>
-                </m:sub>
-              </m:sSub>
+              </m:d>
             </m:oMath>
             <w:r>
               <w:rPr>
@@ -1810,50 +2074,34 @@
               <w:rPr>
                 <w:sz w:val="20"/>
               </w:rPr>
-              <w:t xml:space="preserve">(</w:t>
-            </w:r>
+              <w:t xml:space="preserve">(div), 4 V</w:t>
+            </w:r>
+          </w:p>
+        </w:tc>
+        <w:tc>
+          <w:tcPr>
+            <w:shd w:val="clear" w:color="auto" w:fill="FFF0C1"/>
+            <w:vAlign w:val="center"/>
+          </w:tcPr>
+          <w:p>
+            <w:pPr>
+              <w:pStyle w:val="Compact"/>
+              <w:jc w:val="center"/>
+            </w:pPr>
             <m:oMath>
-              <m:r>
-                <m:t>I</m:t>
-              </m:r>
-            </m:oMath>
-            <w:r>
-              <w:rPr>
-                <w:sz w:val="20"/>
-              </w:rPr>
-              <w:t xml:space="preserve"> </w:t>
-            </w:r>
-            <w:r>
-              <w:rPr>
-                <w:sz w:val="20"/>
-              </w:rPr>
-              <w:t xml:space="preserve">= ___ A)</w:t>
-            </w:r>
-          </w:p>
-        </w:tc>
-        <w:tc>
-          <w:tcPr>
-            <w:shd w:val="clear" w:color="auto" w:fill="FFF0C1"/>
-            <w:vAlign w:val="center"/>
-          </w:tcPr>
-          <w:p>
-            <w:pPr>
-              <w:pStyle w:val="Compact"/>
-              <w:jc w:val="center"/>
-            </w:pPr>
-            <m:oMath>
-              <m:sSub>
+              <m:d>
+                <m:dPr>
+                  <m:begChr m:val="|"/>
+                  <m:endChr m:val="|"/>
+                  <m:sepChr m:val=""/>
+                  <m:grow/>
+                </m:dPr>
                 <m:e>
                   <m:r>
-                    <m:t>A</m:t>
+                    <m:t>φ</m:t>
                   </m:r>
                 </m:e>
-                <m:sub>
-                  <m:r>
-                    <m:t>n</m:t>
-                  </m:r>
-                </m:sub>
-              </m:sSub>
+              </m:d>
             </m:oMath>
             <w:r>
               <w:rPr>
@@ -1865,50 +2113,34 @@
               <w:rPr>
                 <w:sz w:val="20"/>
               </w:rPr>
-              <w:t xml:space="preserve">(</w:t>
-            </w:r>
+              <w:t xml:space="preserve">(div), 6 V</w:t>
+            </w:r>
+          </w:p>
+        </w:tc>
+        <w:tc>
+          <w:tcPr>
+            <w:shd w:val="clear" w:color="auto" w:fill="FFF0C1"/>
+            <w:vAlign w:val="center"/>
+          </w:tcPr>
+          <w:p>
+            <w:pPr>
+              <w:pStyle w:val="Compact"/>
+              <w:jc w:val="center"/>
+            </w:pPr>
             <m:oMath>
-              <m:r>
-                <m:t>I</m:t>
-              </m:r>
-            </m:oMath>
-            <w:r>
-              <w:rPr>
-                <w:sz w:val="20"/>
-              </w:rPr>
-              <w:t xml:space="preserve"> </w:t>
-            </w:r>
-            <w:r>
-              <w:rPr>
-                <w:sz w:val="20"/>
-              </w:rPr>
-              <w:t xml:space="preserve">= ___ A)</w:t>
-            </w:r>
-          </w:p>
-        </w:tc>
-        <w:tc>
-          <w:tcPr>
-            <w:shd w:val="clear" w:color="auto" w:fill="FFF0C1"/>
-            <w:vAlign w:val="center"/>
-          </w:tcPr>
-          <w:p>
-            <w:pPr>
-              <w:pStyle w:val="Compact"/>
-              <w:jc w:val="center"/>
-            </w:pPr>
-            <m:oMath>
-              <m:sSub>
+              <m:d>
+                <m:dPr>
+                  <m:begChr m:val="|"/>
+                  <m:endChr m:val="|"/>
+                  <m:sepChr m:val=""/>
+                  <m:grow/>
+                </m:dPr>
                 <m:e>
                   <m:r>
-                    <m:t>A</m:t>
+                    <m:t>φ</m:t>
                   </m:r>
                 </m:e>
-                <m:sub>
-                  <m:r>
-                    <m:t>n</m:t>
-                  </m:r>
-                </m:sub>
-              </m:sSub>
+              </m:d>
             </m:oMath>
             <w:r>
               <w:rPr>
@@ -1920,24 +2152,367 @@
               <w:rPr>
                 <w:sz w:val="20"/>
               </w:rPr>
-              <w:t xml:space="preserve">(</w:t>
-            </w:r>
-            <m:oMath>
-              <m:r>
-                <m:t>I</m:t>
-              </m:r>
-            </m:oMath>
-            <w:r>
-              <w:rPr>
-                <w:sz w:val="20"/>
-              </w:rPr>
-              <w:t xml:space="preserve"> </w:t>
-            </w:r>
-            <w:r>
-              <w:rPr>
-                <w:sz w:val="20"/>
-              </w:rPr>
-              <w:t xml:space="preserve">= ___ A)</w:t>
+              <w:t xml:space="preserve">(div), 8 V</w:t>
+            </w:r>
+          </w:p>
+        </w:tc>
+      </w:tr>
+      <w:tr>
+        <w:trPr>
+          <w:trHeight w:val="425" w:hRule="atLeast"/>
+        </w:trPr>
+        <w:tc>
+          <w:tcPr>
+            <w:vAlign w:val="center"/>
+          </w:tcPr>
+          <w:p>
+            <w:pPr>
+              <w:pStyle w:val="Compact"/>
+              <w:jc w:val="center"/>
+            </w:pPr>
+            <w:r>
+              <w:rPr>
+                <w:sz w:val="20"/>
+              </w:rPr>
+              <w:t xml:space="preserve"> </w:t>
+            </w:r>
+          </w:p>
+        </w:tc>
+        <w:tc>
+          <w:tcPr>
+            <w:vAlign w:val="center"/>
+          </w:tcPr>
+          <w:p>
+            <w:pPr>
+              <w:pStyle w:val="Compact"/>
+              <w:jc w:val="center"/>
+            </w:pPr>
+            <w:r>
+              <w:rPr>
+                <w:sz w:val="20"/>
+              </w:rPr>
+              <w:t xml:space="preserve"> </w:t>
+            </w:r>
+          </w:p>
+        </w:tc>
+        <w:tc>
+          <w:tcPr>
+            <w:vAlign w:val="center"/>
+          </w:tcPr>
+          <w:p>
+            <w:pPr>
+              <w:pStyle w:val="Compact"/>
+              <w:jc w:val="center"/>
+            </w:pPr>
+            <w:r>
+              <w:rPr>
+                <w:sz w:val="20"/>
+              </w:rPr>
+              <w:t xml:space="preserve"> </w:t>
+            </w:r>
+          </w:p>
+        </w:tc>
+        <w:tc>
+          <w:tcPr>
+            <w:vAlign w:val="center"/>
+          </w:tcPr>
+          <w:p>
+            <w:pPr>
+              <w:pStyle w:val="Compact"/>
+              <w:jc w:val="center"/>
+            </w:pPr>
+            <w:r>
+              <w:rPr>
+                <w:sz w:val="20"/>
+              </w:rPr>
+              <w:t xml:space="preserve"> </w:t>
+            </w:r>
+          </w:p>
+        </w:tc>
+        <w:tc>
+          <w:tcPr>
+            <w:vAlign w:val="center"/>
+          </w:tcPr>
+          <w:p>
+            <w:pPr>
+              <w:pStyle w:val="Compact"/>
+              <w:jc w:val="center"/>
+            </w:pPr>
+            <w:r>
+              <w:rPr>
+                <w:sz w:val="20"/>
+              </w:rPr>
+              <w:t xml:space="preserve"> </w:t>
+            </w:r>
+          </w:p>
+        </w:tc>
+      </w:tr>
+      <w:tr>
+        <w:trPr>
+          <w:trHeight w:val="425" w:hRule="atLeast"/>
+        </w:trPr>
+        <w:tc>
+          <w:tcPr>
+            <w:vAlign w:val="center"/>
+          </w:tcPr>
+          <w:p>
+            <w:pPr>
+              <w:pStyle w:val="Compact"/>
+              <w:jc w:val="center"/>
+            </w:pPr>
+            <w:r>
+              <w:rPr>
+                <w:sz w:val="20"/>
+              </w:rPr>
+              <w:t xml:space="preserve"> </w:t>
+            </w:r>
+          </w:p>
+        </w:tc>
+        <w:tc>
+          <w:tcPr>
+            <w:vAlign w:val="center"/>
+          </w:tcPr>
+          <w:p>
+            <w:pPr>
+              <w:pStyle w:val="Compact"/>
+              <w:jc w:val="center"/>
+            </w:pPr>
+            <w:r>
+              <w:rPr>
+                <w:sz w:val="20"/>
+              </w:rPr>
+              <w:t xml:space="preserve"> </w:t>
+            </w:r>
+          </w:p>
+        </w:tc>
+        <w:tc>
+          <w:tcPr>
+            <w:vAlign w:val="center"/>
+          </w:tcPr>
+          <w:p>
+            <w:pPr>
+              <w:pStyle w:val="Compact"/>
+              <w:jc w:val="center"/>
+            </w:pPr>
+            <w:r>
+              <w:rPr>
+                <w:sz w:val="20"/>
+              </w:rPr>
+              <w:t xml:space="preserve"> </w:t>
+            </w:r>
+          </w:p>
+        </w:tc>
+        <w:tc>
+          <w:tcPr>
+            <w:vAlign w:val="center"/>
+          </w:tcPr>
+          <w:p>
+            <w:pPr>
+              <w:pStyle w:val="Compact"/>
+              <w:jc w:val="center"/>
+            </w:pPr>
+            <w:r>
+              <w:rPr>
+                <w:sz w:val="20"/>
+              </w:rPr>
+              <w:t xml:space="preserve"> </w:t>
+            </w:r>
+          </w:p>
+        </w:tc>
+        <w:tc>
+          <w:tcPr>
+            <w:vAlign w:val="center"/>
+          </w:tcPr>
+          <w:p>
+            <w:pPr>
+              <w:pStyle w:val="Compact"/>
+              <w:jc w:val="center"/>
+            </w:pPr>
+            <w:r>
+              <w:rPr>
+                <w:sz w:val="20"/>
+              </w:rPr>
+              <w:t xml:space="preserve"> </w:t>
+            </w:r>
+          </w:p>
+        </w:tc>
+      </w:tr>
+      <w:tr>
+        <w:trPr>
+          <w:trHeight w:val="425" w:hRule="atLeast"/>
+        </w:trPr>
+        <w:tc>
+          <w:tcPr>
+            <w:vAlign w:val="center"/>
+          </w:tcPr>
+          <w:p>
+            <w:pPr>
+              <w:pStyle w:val="Compact"/>
+              <w:jc w:val="center"/>
+            </w:pPr>
+            <w:r>
+              <w:rPr>
+                <w:sz w:val="20"/>
+              </w:rPr>
+              <w:t xml:space="preserve"> </w:t>
+            </w:r>
+          </w:p>
+        </w:tc>
+        <w:tc>
+          <w:tcPr>
+            <w:vAlign w:val="center"/>
+          </w:tcPr>
+          <w:p>
+            <w:pPr>
+              <w:pStyle w:val="Compact"/>
+              <w:jc w:val="center"/>
+            </w:pPr>
+            <w:r>
+              <w:rPr>
+                <w:sz w:val="20"/>
+              </w:rPr>
+              <w:t xml:space="preserve"> </w:t>
+            </w:r>
+          </w:p>
+        </w:tc>
+        <w:tc>
+          <w:tcPr>
+            <w:vAlign w:val="center"/>
+          </w:tcPr>
+          <w:p>
+            <w:pPr>
+              <w:pStyle w:val="Compact"/>
+              <w:jc w:val="center"/>
+            </w:pPr>
+            <w:r>
+              <w:rPr>
+                <w:sz w:val="20"/>
+              </w:rPr>
+              <w:t xml:space="preserve"> </w:t>
+            </w:r>
+          </w:p>
+        </w:tc>
+        <w:tc>
+          <w:tcPr>
+            <w:vAlign w:val="center"/>
+          </w:tcPr>
+          <w:p>
+            <w:pPr>
+              <w:pStyle w:val="Compact"/>
+              <w:jc w:val="center"/>
+            </w:pPr>
+            <w:r>
+              <w:rPr>
+                <w:sz w:val="20"/>
+              </w:rPr>
+              <w:t xml:space="preserve"> </w:t>
+            </w:r>
+          </w:p>
+        </w:tc>
+        <w:tc>
+          <w:tcPr>
+            <w:vAlign w:val="center"/>
+          </w:tcPr>
+          <w:p>
+            <w:pPr>
+              <w:pStyle w:val="Compact"/>
+              <w:jc w:val="center"/>
+            </w:pPr>
+            <w:r>
+              <w:rPr>
+                <w:sz w:val="20"/>
+              </w:rPr>
+              <w:t xml:space="preserve"> </w:t>
+            </w:r>
+          </w:p>
+        </w:tc>
+      </w:tr>
+      <w:tr>
+        <w:trPr>
+          <w:trHeight w:val="425" w:hRule="atLeast"/>
+        </w:trPr>
+        <w:tc>
+          <w:tcPr>
+            <w:vAlign w:val="center"/>
+          </w:tcPr>
+          <w:p>
+            <w:pPr>
+              <w:pStyle w:val="Compact"/>
+              <w:jc w:val="center"/>
+            </w:pPr>
+            <w:r>
+              <w:rPr>
+                <w:sz w:val="20"/>
+              </w:rPr>
+              <w:t xml:space="preserve"> </w:t>
+            </w:r>
+          </w:p>
+        </w:tc>
+        <w:tc>
+          <w:tcPr>
+            <w:vAlign w:val="center"/>
+          </w:tcPr>
+          <w:p>
+            <w:pPr>
+              <w:pStyle w:val="Compact"/>
+              <w:jc w:val="center"/>
+            </w:pPr>
+            <w:r>
+              <w:rPr>
+                <w:sz w:val="20"/>
+              </w:rPr>
+              <w:t xml:space="preserve"> </w:t>
+            </w:r>
+          </w:p>
+        </w:tc>
+        <w:tc>
+          <w:tcPr>
+            <w:vAlign w:val="center"/>
+          </w:tcPr>
+          <w:p>
+            <w:pPr>
+              <w:pStyle w:val="Compact"/>
+              <w:jc w:val="center"/>
+            </w:pPr>
+            <w:r>
+              <w:rPr>
+                <w:sz w:val="20"/>
+              </w:rPr>
+              <w:t xml:space="preserve"> </w:t>
+            </w:r>
+          </w:p>
+        </w:tc>
+        <w:tc>
+          <w:tcPr>
+            <w:vAlign w:val="center"/>
+          </w:tcPr>
+          <w:p>
+            <w:pPr>
+              <w:pStyle w:val="Compact"/>
+              <w:jc w:val="center"/>
+            </w:pPr>
+            <w:r>
+              <w:rPr>
+                <w:sz w:val="20"/>
+              </w:rPr>
+              <w:t xml:space="preserve"> </w:t>
+            </w:r>
+          </w:p>
+        </w:tc>
+        <w:tc>
+          <w:tcPr>
+            <w:vAlign w:val="center"/>
+          </w:tcPr>
+          <w:p>
+            <w:pPr>
+              <w:pStyle w:val="Compact"/>
+              <w:jc w:val="center"/>
+            </w:pPr>
+            <w:r>
+              <w:rPr>
+                <w:sz w:val="20"/>
+              </w:rPr>
+              <w:t xml:space="preserve"> </w:t>
             </w:r>
           </w:p>
         </w:tc>
@@ -2939,7 +3514,18 @@
         <w:jc w:val="center"/>
       </w:pPr>
       <w:r>
-        <w:t xml:space="preserve">Tabla 2. Amplitudes de los máximos sucesivos (divisiones).</w:t>
+        <w:t xml:space="preserve">Tabla 2. Amplitudes de los extremos sucesivos (</w:t>
+      </w:r>
+      <m:oMath>
+        <m:r>
+          <m:t>k</m:t>
+        </m:r>
+      </m:oMath>
+      <w:r>
+        <w:t xml:space="preserve"> </w:t>
+      </w:r>
+      <w:r>
+        <w:t xml:space="preserve">= 0 a 14).</w:t>
       </w:r>
     </w:p>
     <w:p>
@@ -2960,7 +3546,7 @@
           <w:insideV w:val="single" w:sz="6" w:color="000000"/>
         </w:tblBorders>
         <w:tblLook w:firstRow="1" w:lastRow="0" w:firstColumn="0" w:lastColumn="0" w:noHBand="0" w:noVBand="0" w:val="0020"/>
-        <w:tblCaption w:val="Tabla 3. Resultados para cada corriente."/>
+        <w:tblCaption w:val="Tabla 3. Resultados para cada tensión del freno."/>
       </w:tblPr>
       <w:tblGrid>
         <w:gridCol w:w="1131"/>
@@ -2987,9 +3573,18 @@
               <w:jc w:val="center"/>
             </w:pPr>
             <m:oMath>
-              <m:r>
-                <m:t>I</m:t>
-              </m:r>
+              <m:sSub>
+                <m:e>
+                  <m:r>
+                    <m:t>V</m:t>
+                  </m:r>
+                </m:e>
+                <m:sub>
+                  <m:r>
+                    <m:t>B</m:t>
+                  </m:r>
+                </m:sub>
+              </m:sSub>
             </m:oMath>
             <w:r>
               <w:rPr>
@@ -3001,54 +3596,8 @@
               <w:rPr>
                 <w:sz w:val="20"/>
               </w:rPr>
-              <w:t xml:space="preserve">(A)</w:t>
-            </w:r>
-          </w:p>
-        </w:tc>
-        <w:tc>
-          <w:tcPr>
-            <w:shd w:val="clear" w:color="auto" w:fill="FFF0C1"/>
-            <w:vAlign w:val="center"/>
-          </w:tcPr>
-          <w:p>
-            <w:pPr>
-              <w:pStyle w:val="Compact"/>
-              <w:jc w:val="center"/>
-            </w:pPr>
-            <m:oMath>
-              <m:r>
-                <m:t>T</m:t>
-              </m:r>
-            </m:oMath>
-            <w:r>
-              <w:rPr>
-                <w:sz w:val="20"/>
-              </w:rPr>
-              <w:t xml:space="preserve"> </w:t>
-            </w:r>
-            <w:r>
-              <w:rPr>
-                <w:sz w:val="20"/>
-              </w:rPr>
-              <w:t xml:space="preserve">(s)</w:t>
-            </w:r>
-          </w:p>
-        </w:tc>
-        <w:tc>
-          <w:tcPr>
-            <w:shd w:val="clear" w:color="auto" w:fill="FFF0C1"/>
-            <w:vAlign w:val="center"/>
-          </w:tcPr>
-          <w:p>
-            <w:pPr>
-              <w:pStyle w:val="Compact"/>
-              <w:jc w:val="center"/>
-            </w:pPr>
-            <m:oMath>
-              <m:r>
-                <m:t>δ</m:t>
-              </m:r>
-            </m:oMath>
+              <w:t xml:space="preserve">(V)</w:t>
+            </w:r>
           </w:p>
         </w:tc>
         <w:tc>
@@ -3065,16 +3614,28 @@
               <m:sSub>
                 <m:e>
                   <m:r>
-                    <m:t>ε</m:t>
+                    <m:t>I</m:t>
                   </m:r>
                 </m:e>
                 <m:sub>
                   <m:r>
-                    <m:t>δ</m:t>
+                    <m:t>B</m:t>
                   </m:r>
                 </m:sub>
               </m:sSub>
             </m:oMath>
+            <w:r>
+              <w:rPr>
+                <w:sz w:val="20"/>
+              </w:rPr>
+              <w:t xml:space="preserve"> </w:t>
+            </w:r>
+            <w:r>
+              <w:rPr>
+                <w:sz w:val="20"/>
+              </w:rPr>
+              <w:t xml:space="preserve">(A)</w:t>
+            </w:r>
           </w:p>
         </w:tc>
         <w:tc>
@@ -3156,133 +3717,58 @@
             </w:pPr>
             <m:oMath>
               <m:r>
+                <m:t>K</m:t>
+              </m:r>
+            </m:oMath>
+          </w:p>
+        </w:tc>
+        <w:tc>
+          <w:tcPr>
+            <w:shd w:val="clear" w:color="auto" w:fill="FFF0C1"/>
+            <w:vAlign w:val="center"/>
+          </w:tcPr>
+          <w:p>
+            <w:pPr>
+              <w:pStyle w:val="Compact"/>
+              <w:jc w:val="center"/>
+            </w:pPr>
+            <m:oMath>
+              <m:r>
+                <m:t>δ</m:t>
+              </m:r>
+              <m:r>
+                <m:rPr>
+                  <m:sty m:val="p"/>
+                </m:rPr>
+                <m:t>=</m:t>
+              </m:r>
+              <m:r>
+                <m:rPr>
+                  <m:sty m:val="p"/>
+                </m:rPr>
+                <m:t>ln</m:t>
+              </m:r>
+              <m:r>
+                <m:t>K</m:t>
+              </m:r>
+            </m:oMath>
+          </w:p>
+        </w:tc>
+        <w:tc>
+          <w:tcPr>
+            <w:shd w:val="clear" w:color="auto" w:fill="FFF0C1"/>
+            <w:vAlign w:val="center"/>
+          </w:tcPr>
+          <w:p>
+            <w:pPr>
+              <w:pStyle w:val="Compact"/>
+              <w:jc w:val="center"/>
+            </w:pPr>
+            <m:oMath>
+              <m:r>
                 <m:t>Q</m:t>
               </m:r>
             </m:oMath>
-          </w:p>
-        </w:tc>
-      </w:tr>
-      <w:tr>
-        <w:trPr>
-          <w:trHeight w:val="425" w:hRule="atLeast"/>
-        </w:trPr>
-        <w:tc>
-          <w:tcPr>
-            <w:vAlign w:val="center"/>
-          </w:tcPr>
-          <w:p>
-            <w:pPr>
-              <w:pStyle w:val="Compact"/>
-              <w:jc w:val="center"/>
-            </w:pPr>
-            <w:r>
-              <w:rPr>
-                <w:sz w:val="20"/>
-              </w:rPr>
-              <w:t xml:space="preserve"> </w:t>
-            </w:r>
-          </w:p>
-        </w:tc>
-        <w:tc>
-          <w:tcPr>
-            <w:vAlign w:val="center"/>
-          </w:tcPr>
-          <w:p>
-            <w:pPr>
-              <w:pStyle w:val="Compact"/>
-              <w:jc w:val="center"/>
-            </w:pPr>
-            <w:r>
-              <w:rPr>
-                <w:sz w:val="20"/>
-              </w:rPr>
-              <w:t xml:space="preserve"> </w:t>
-            </w:r>
-          </w:p>
-        </w:tc>
-        <w:tc>
-          <w:tcPr>
-            <w:vAlign w:val="center"/>
-          </w:tcPr>
-          <w:p>
-            <w:pPr>
-              <w:pStyle w:val="Compact"/>
-              <w:jc w:val="center"/>
-            </w:pPr>
-            <w:r>
-              <w:rPr>
-                <w:sz w:val="20"/>
-              </w:rPr>
-              <w:t xml:space="preserve"> </w:t>
-            </w:r>
-          </w:p>
-        </w:tc>
-        <w:tc>
-          <w:tcPr>
-            <w:vAlign w:val="center"/>
-          </w:tcPr>
-          <w:p>
-            <w:pPr>
-              <w:pStyle w:val="Compact"/>
-              <w:jc w:val="center"/>
-            </w:pPr>
-            <w:r>
-              <w:rPr>
-                <w:sz w:val="20"/>
-              </w:rPr>
-              <w:t xml:space="preserve"> </w:t>
-            </w:r>
-          </w:p>
-        </w:tc>
-        <w:tc>
-          <w:tcPr>
-            <w:vAlign w:val="center"/>
-          </w:tcPr>
-          <w:p>
-            <w:pPr>
-              <w:pStyle w:val="Compact"/>
-              <w:jc w:val="center"/>
-            </w:pPr>
-            <w:r>
-              <w:rPr>
-                <w:sz w:val="20"/>
-              </w:rPr>
-              <w:t xml:space="preserve"> </w:t>
-            </w:r>
-          </w:p>
-        </w:tc>
-        <w:tc>
-          <w:tcPr>
-            <w:vAlign w:val="center"/>
-          </w:tcPr>
-          <w:p>
-            <w:pPr>
-              <w:pStyle w:val="Compact"/>
-              <w:jc w:val="center"/>
-            </w:pPr>
-            <w:r>
-              <w:rPr>
-                <w:sz w:val="20"/>
-              </w:rPr>
-              <w:t xml:space="preserve"> </w:t>
-            </w:r>
-          </w:p>
-        </w:tc>
-        <w:tc>
-          <w:tcPr>
-            <w:vAlign w:val="center"/>
-          </w:tcPr>
-          <w:p>
-            <w:pPr>
-              <w:pStyle w:val="Compact"/>
-              <w:jc w:val="center"/>
-            </w:pPr>
-            <w:r>
-              <w:rPr>
-                <w:sz w:val="20"/>
-              </w:rPr>
-              <w:t xml:space="preserve"> </w:t>
-            </w:r>
           </w:p>
         </w:tc>
       </w:tr>
@@ -3665,11 +4151,11 @@
         <w:jc w:val="center"/>
       </w:pPr>
       <w:r>
-        <w:t xml:space="preserve">Tabla 3. Resultados para cada corriente.</w:t>
+        <w:t xml:space="preserve">Tabla 3. Resultados para cada tensión del freno.</w:t>
       </w:r>
     </w:p>
-    <w:bookmarkEnd w:id="27"/>
-    <w:bookmarkStart w:id="28" w:name="cuestiones"/>
+    <w:bookmarkEnd w:id="30"/>
+    <w:bookmarkStart w:id="31" w:name="cuestiones"/>
     <w:p>
       <w:pPr>
         <w:pStyle w:val="Heading2"/>
@@ -3701,27 +4187,45 @@
         <w:t xml:space="preserve"> </w:t>
       </w:r>
       <w:r>
-        <w:t xml:space="preserve">Inserte en una misma gráfica</w:t>
+        <w:t xml:space="preserve">Inserte en una misma gráfica la amplitud</w:t>
       </w:r>
       <w:r>
         <w:t xml:space="preserve"> </w:t>
       </w:r>
       <m:oMath>
-        <m:r>
-          <m:rPr>
-            <m:sty m:val="p"/>
-          </m:rPr>
-          <m:t>ln</m:t>
-        </m:r>
+        <m:d>
+          <m:dPr>
+            <m:begChr m:val="|"/>
+            <m:endChr m:val="|"/>
+            <m:sepChr m:val=""/>
+            <m:grow/>
+          </m:dPr>
+          <m:e>
+            <m:r>
+              <m:t>φ</m:t>
+            </m:r>
+          </m:e>
+        </m:d>
+      </m:oMath>
+      <w:r>
+        <w:t xml:space="preserve"> </w:t>
+      </w:r>
+      <w:r>
+        <w:t xml:space="preserve">frente al tiempo para</w:t>
+      </w:r>
+      <w:r>
+        <w:t xml:space="preserve"> </w:t>
+      </w:r>
+      <m:oMath>
         <m:sSub>
           <m:e>
             <m:r>
-              <m:t>A</m:t>
+              <m:t>V</m:t>
             </m:r>
           </m:e>
           <m:sub>
             <m:r>
-              <m:t>n</m:t>
+              <m:t>B</m:t>
             </m:r>
           </m:sub>
         </m:sSub>
@@ -3730,21 +4234,7 @@
         <w:t xml:space="preserve"> </w:t>
       </w:r>
       <w:r>
-        <w:t xml:space="preserve">frente a</w:t>
-      </w:r>
-      <w:r>
-        <w:t xml:space="preserve"> </w:t>
-      </w:r>
-      <m:oMath>
-        <m:r>
-          <m:t>n</m:t>
-        </m:r>
-      </m:oMath>
-      <w:r>
-        <w:t xml:space="preserve"> </w:t>
-      </w:r>
-      <w:r>
-        <w:t xml:space="preserve">para las cuatro corrientes, con sus rectas de ajuste.</w:t>
+        <w:t xml:space="preserve">= 4, 6 y 8 V.</w:t>
       </w:r>
     </w:p>
     <w:tbl>
@@ -3805,40 +4295,75 @@
         <w:t xml:space="preserve"> </w:t>
       </w:r>
       <w:r>
-        <w:t xml:space="preserve">Obtenga de cada pendiente el decremento logarítmico</w:t>
+        <w:t xml:space="preserve">Inserte la gráfica de</w:t>
       </w:r>
       <w:r>
         <w:t xml:space="preserve"> </w:t>
       </w:r>
       <m:oMath>
         <m:r>
-          <m:t>δ</m:t>
-        </m:r>
+          <m:rPr>
+            <m:sty m:val="p"/>
+          </m:rPr>
+          <m:t>ln</m:t>
+        </m:r>
+        <m:d>
+          <m:dPr>
+            <m:begChr m:val="|"/>
+            <m:endChr m:val="|"/>
+            <m:sepChr m:val=""/>
+            <m:grow/>
+          </m:dPr>
+          <m:e>
+            <m:r>
+              <m:t>φ</m:t>
+            </m:r>
+          </m:e>
+        </m:d>
       </m:oMath>
       <w:r>
         <w:t xml:space="preserve"> </w:t>
       </w:r>
       <w:r>
-        <w:t xml:space="preserve">con su error y, con</w:t>
+        <w:t xml:space="preserve">frente a</w:t>
       </w:r>
       <w:r>
         <w:t xml:space="preserve"> </w:t>
       </w:r>
       <m:oMath>
         <m:r>
-          <m:t>T</m:t>
+          <m:t>t</m:t>
         </m:r>
       </m:oMath>
       <w:r>
-        <w:t xml:space="preserve">, el ritmo de amortiguamiento</w:t>
+        <w:t xml:space="preserve"> </w:t>
+      </w:r>
+      <w:r>
+        <w:t xml:space="preserve">con las rectas de ajuste</w:t>
       </w:r>
       <w:r>
         <w:t xml:space="preserve"> </w:t>
       </w:r>
       <m:oMath>
         <m:r>
-          <m:t>γ</m:t>
-        </m:r>
+          <m:rPr>
+            <m:sty m:val="p"/>
+          </m:rPr>
+          <m:t>ln</m:t>
+        </m:r>
+        <m:d>
+          <m:dPr>
+            <m:begChr m:val="|"/>
+            <m:endChr m:val="|"/>
+            <m:sepChr m:val=""/>
+            <m:grow/>
+          </m:dPr>
+          <m:e>
+            <m:r>
+              <m:t>φ</m:t>
+            </m:r>
+          </m:e>
+        </m:d>
         <m:r>
           <m:rPr>
             <m:sty m:val="p"/>
@@ -3846,10 +4371,147 @@
           <m:t>=</m:t>
         </m:r>
         <m:r>
-          <m:t>2</m:t>
-        </m:r>
-        <m:r>
-          <m:t>δ</m:t>
+          <m:t>a</m:t>
+        </m:r>
+        <m:r>
+          <m:t> </m:t>
+        </m:r>
+        <m:r>
+          <m:t>t</m:t>
+        </m:r>
+        <m:r>
+          <m:rPr>
+            <m:sty m:val="p"/>
+          </m:rPr>
+          <m:t>+</m:t>
+        </m:r>
+        <m:r>
+          <m:t>b</m:t>
+        </m:r>
+      </m:oMath>
+      <w:r>
+        <w:t xml:space="preserve">. Para</w:t>
+      </w:r>
+      <w:r>
+        <w:t xml:space="preserve"> </w:t>
+      </w:r>
+      <m:oMath>
+        <m:sSub>
+          <m:e>
+            <m:r>
+              <m:t>V</m:t>
+            </m:r>
+          </m:e>
+          <m:sub>
+            <m:r>
+              <m:t>B</m:t>
+            </m:r>
+          </m:sub>
+        </m:sSub>
+      </m:oMath>
+      <w:r>
+        <w:t xml:space="preserve"> </w:t>
+      </w:r>
+      <w:r>
+        <w:t xml:space="preserve">= 4 V, dé</w:t>
+      </w:r>
+      <w:r>
+        <w:t xml:space="preserve"> </w:t>
+      </w:r>
+      <m:oMath>
+        <m:r>
+          <m:t>r</m:t>
+        </m:r>
+      </m:oMath>
+      <w:r>
+        <w:t xml:space="preserve">,</w:t>
+      </w:r>
+      <w:r>
+        <w:t xml:space="preserve"> </w:t>
+      </w:r>
+      <m:oMath>
+        <m:r>
+          <m:t>a</m:t>
+        </m:r>
+      </m:oMath>
+      <w:r>
+        <w:t xml:space="preserve"> </w:t>
+      </w:r>
+      <w:r>
+        <w:t xml:space="preserve">y</w:t>
+      </w:r>
+      <w:r>
+        <w:t xml:space="preserve"> </w:t>
+      </w:r>
+      <m:oMath>
+        <m:r>
+          <m:t>b</m:t>
+        </m:r>
+      </m:oMath>
+      <w:r>
+        <w:t xml:space="preserve"> </w:t>
+      </w:r>
+      <w:r>
+        <w:t xml:space="preserve">con sus errores. Comparando con</w:t>
+      </w:r>
+      <w:r>
+        <w:t xml:space="preserve"> </w:t>
+      </w:r>
+      <m:oMath>
+        <m:r>
+          <m:rPr>
+            <m:sty m:val="p"/>
+          </m:rPr>
+          <m:t>ln</m:t>
+        </m:r>
+        <m:d>
+          <m:dPr>
+            <m:begChr m:val="|"/>
+            <m:endChr m:val="|"/>
+            <m:sepChr m:val=""/>
+            <m:grow/>
+          </m:dPr>
+          <m:e>
+            <m:r>
+              <m:t>φ</m:t>
+            </m:r>
+          </m:e>
+        </m:d>
+        <m:r>
+          <m:rPr>
+            <m:sty m:val="p"/>
+          </m:rPr>
+          <m:t>=</m:t>
+        </m:r>
+        <m:r>
+          <m:rPr>
+            <m:sty m:val="p"/>
+          </m:rPr>
+          <m:t>ln</m:t>
+        </m:r>
+        <m:sSub>
+          <m:e>
+            <m:r>
+              <m:t>φ</m:t>
+            </m:r>
+          </m:e>
+          <m:sub>
+            <m:r>
+              <m:t>0</m:t>
+            </m:r>
+          </m:sub>
+        </m:sSub>
+        <m:r>
+          <m:rPr>
+            <m:sty m:val="p"/>
+          </m:rPr>
+          <m:t>−</m:t>
+        </m:r>
+        <m:r>
+          <m:t>γ</m:t>
+        </m:r>
+        <m:r>
+          <m:t>t</m:t>
         </m:r>
         <m:r>
           <m:rPr>
@@ -3858,52 +4520,58 @@
           <m:t>/</m:t>
         </m:r>
         <m:r>
-          <m:t>T</m:t>
+          <m:t>2</m:t>
         </m:r>
       </m:oMath>
       <w:r>
-        <w:t xml:space="preserve"> </w:t>
-      </w:r>
-      <w:r>
-        <w:t xml:space="preserve">y el factor de calidad</w:t>
+        <w:t xml:space="preserve">, obtenga para cada tensión</w:t>
       </w:r>
       <w:r>
         <w:t xml:space="preserve"> </w:t>
       </w:r>
       <m:oMath>
         <m:r>
+          <m:t>γ</m:t>
+        </m:r>
+      </m:oMath>
+      <w:r>
+        <w:t xml:space="preserve">,</w:t>
+      </w:r>
+      <w:r>
+        <w:t xml:space="preserve"> </w:t>
+      </w:r>
+      <m:oMath>
+        <m:r>
+          <m:t>K</m:t>
+        </m:r>
+      </m:oMath>
+      <w:r>
+        <w:t xml:space="preserve">,</w:t>
+      </w:r>
+      <w:r>
+        <w:t xml:space="preserve"> </w:t>
+      </w:r>
+      <m:oMath>
+        <m:r>
+          <m:t>δ</m:t>
+        </m:r>
+      </m:oMath>
+      <w:r>
+        <w:t xml:space="preserve"> </w:t>
+      </w:r>
+      <w:r>
+        <w:t xml:space="preserve">y</w:t>
+      </w:r>
+      <w:r>
+        <w:t xml:space="preserve"> </w:t>
+      </w:r>
+      <m:oMath>
+        <m:r>
           <m:t>Q</m:t>
         </m:r>
-        <m:r>
-          <m:rPr>
-            <m:sty m:val="p"/>
-          </m:rPr>
-          <m:t>=</m:t>
-        </m:r>
-        <m:sSub>
-          <m:e>
-            <m:r>
-              <m:t>ω</m:t>
-            </m:r>
-          </m:e>
-          <m:sub>
-            <m:r>
-              <m:t>0</m:t>
-            </m:r>
-          </m:sub>
-        </m:sSub>
-        <m:r>
-          <m:rPr>
-            <m:sty m:val="p"/>
-          </m:rPr>
-          <m:t>/</m:t>
-        </m:r>
-        <m:r>
-          <m:t>γ</m:t>
-        </m:r>
       </m:oMath>
       <w:r>
-        <w:t xml:space="preserve">. Complete la Tabla 3.</w:t>
+        <w:t xml:space="preserve">, y complete la Tabla 3.</w:t>
       </w:r>
     </w:p>
     <w:tbl>
@@ -3924,13 +4592,26 @@
       </w:tblGrid>
       <w:tr>
         <w:trPr>
-          <w:trHeight w:val="1701" w:hRule="atLeast"/>
+          <w:trHeight w:val="5103" w:hRule="atLeast"/>
         </w:trPr>
         <w:tc>
           <w:tcPr>
             <w:tcW w:type="dxa" w:w="9524"/>
-          </w:tcPr>
-          <w:p/>
+            <w:vAlign w:val="center"/>
+          </w:tcPr>
+          <w:p>
+            <w:pPr>
+              <w:jc w:val="center"/>
+            </w:pPr>
+            <w:r>
+              <w:rPr>
+                <w:i/>
+                <w:color w:val="999999"/>
+                <w:sz w:val="20"/>
+              </w:rPr>
+              <w:t>Pegue aquí la gráfica</w:t>
+            </w:r>
+          </w:p>
         </w:tc>
       </w:tr>
     </w:tbl>
@@ -3940,6 +4621,57 @@
         <w:pStyle w:val="BodyText"/>
         <w:jc w:val="both"/>
       </w:pPr>
+      <m:oMath>
+        <m:r>
+          <m:t>r</m:t>
+        </m:r>
+      </m:oMath>
+      <w:r>
+        <w:t xml:space="preserve"> </w:t>
+      </w:r>
+      <w:r>
+        <w:t xml:space="preserve">= __________</w:t>
+      </w:r>
+      <w:r>
+        <w:t xml:space="preserve"> </w:t>
+      </w:r>
+      <m:oMath>
+        <m:r>
+          <m:t>  </m:t>
+        </m:r>
+        <m:r>
+          <m:t>a</m:t>
+        </m:r>
+      </m:oMath>
+      <w:r>
+        <w:t xml:space="preserve"> </w:t>
+      </w:r>
+      <w:r>
+        <w:t xml:space="preserve">= ( __________ ± __________ ) s⁻¹</w:t>
+      </w:r>
+      <w:r>
+        <w:t xml:space="preserve"> </w:t>
+      </w:r>
+      <m:oMath>
+        <m:r>
+          <m:t>  </m:t>
+        </m:r>
+        <m:r>
+          <m:t>b</m:t>
+        </m:r>
+      </m:oMath>
+      <w:r>
+        <w:t xml:space="preserve"> </w:t>
+      </w:r>
+      <w:r>
+        <w:t xml:space="preserve">= ( __________ ± __________ )</w:t>
+      </w:r>
+    </w:p>
+    <w:p>
+      <w:pPr>
+        <w:pStyle w:val="BodyText"/>
+        <w:jc w:val="both"/>
+      </w:pPr>
       <w:r>
         <w:rPr>
           <w:bCs/>
@@ -3971,18 +4703,23 @@
         <w:t xml:space="preserve"> </w:t>
       </w:r>
       <m:oMath>
-        <m:sSup>
+        <m:sSubSup>
           <m:e>
             <m:r>
               <m:t>I</m:t>
             </m:r>
           </m:e>
+          <m:sub>
+            <m:r>
+              <m:t>B</m:t>
+            </m:r>
+          </m:sub>
           <m:sup>
             <m:r>
               <m:t>2</m:t>
             </m:r>
           </m:sup>
-        </m:sSup>
+        </m:sSubSup>
       </m:oMath>
       <w:r>
         <w:t xml:space="preserve"> </w:t>
@@ -4003,18 +4740,23 @@
           </m:rPr>
           <m:t>∝</m:t>
         </m:r>
-        <m:sSup>
+        <m:sSubSup>
           <m:e>
             <m:r>
               <m:t>I</m:t>
             </m:r>
           </m:e>
+          <m:sub>
+            <m:r>
+              <m:t>B</m:t>
+            </m:r>
+          </m:sub>
           <m:sup>
             <m:r>
               <m:t>2</m:t>
             </m:r>
           </m:sup>
-        </m:sSup>
+        </m:sSubSup>
       </m:oMath>
       <w:r>
         <w:t xml:space="preserve">? ¿Qué significa la ordenada en el origen?</w:t>
@@ -4107,21 +4849,7 @@
         <w:t xml:space="preserve"> </w:t>
       </w:r>
       <w:r>
-        <w:t xml:space="preserve">Compare</w:t>
-      </w:r>
-      <w:r>
-        <w:t xml:space="preserve"> </w:t>
-      </w:r>
-      <m:oMath>
-        <m:r>
-          <m:t>T</m:t>
-        </m:r>
-      </m:oMath>
-      <w:r>
-        <w:t xml:space="preserve"> </w:t>
-      </w:r>
-      <w:r>
-        <w:t xml:space="preserve">con</w:t>
+        <w:t xml:space="preserve">En la Parte B se ha tomado</w:t>
       </w:r>
       <w:r>
         <w:t xml:space="preserve"> </w:t>
@@ -4144,20 +4872,32 @@
         <w:t xml:space="preserve"> </w:t>
       </w:r>
       <w:r>
-        <w:t xml:space="preserve">para la corriente más alta. ¿Es apreciable la diferencia predicha por</w:t>
+        <w:t xml:space="preserve">como periodo en todos los casos, pero el periodo amortiguado es</w:t>
       </w:r>
       <w:r>
         <w:t xml:space="preserve"> </w:t>
       </w:r>
       <m:oMath>
         <m:r>
-          <m:t>ω</m:t>
+          <m:t>T</m:t>
         </m:r>
         <m:r>
           <m:rPr>
             <m:sty m:val="p"/>
           </m:rPr>
           <m:t>=</m:t>
+        </m:r>
+        <m:r>
+          <m:t>2</m:t>
+        </m:r>
+        <m:r>
+          <m:t>π</m:t>
+        </m:r>
+        <m:r>
+          <m:rPr>
+            <m:sty m:val="p"/>
+          </m:rPr>
+          <m:t>/</m:t>
         </m:r>
         <m:rad>
           <m:radPr>
@@ -4213,6 +4953,97 @@
         </m:rad>
       </m:oMath>
       <w:r>
+        <w:t xml:space="preserve">. Estime</w:t>
+      </w:r>
+      <w:r>
+        <w:t xml:space="preserve"> </w:t>
+      </w:r>
+      <m:oMath>
+        <m:r>
+          <m:t>T</m:t>
+        </m:r>
+      </m:oMath>
+      <w:r>
+        <w:t xml:space="preserve"> </w:t>
+      </w:r>
+      <w:r>
+        <w:t xml:space="preserve">para</w:t>
+      </w:r>
+      <w:r>
+        <w:t xml:space="preserve"> </w:t>
+      </w:r>
+      <m:oMath>
+        <m:sSub>
+          <m:e>
+            <m:r>
+              <m:t>V</m:t>
+            </m:r>
+          </m:e>
+          <m:sub>
+            <m:r>
+              <m:t>B</m:t>
+            </m:r>
+          </m:sub>
+        </m:sSub>
+      </m:oMath>
+      <w:r>
+        <w:t xml:space="preserve"> </w:t>
+      </w:r>
+      <w:r>
+        <w:t xml:space="preserve">= 4 V con sus valores de</w:t>
+      </w:r>
+      <w:r>
+        <w:t xml:space="preserve"> </w:t>
+      </w:r>
+      <m:oMath>
+        <m:sSub>
+          <m:e>
+            <m:r>
+              <m:t>ω</m:t>
+            </m:r>
+          </m:e>
+          <m:sub>
+            <m:r>
+              <m:t>0</m:t>
+            </m:r>
+          </m:sub>
+        </m:sSub>
+      </m:oMath>
+      <w:r>
+        <w:t xml:space="preserve"> </w:t>
+      </w:r>
+      <w:r>
+        <w:t xml:space="preserve">y</w:t>
+      </w:r>
+      <w:r>
+        <w:t xml:space="preserve"> </w:t>
+      </w:r>
+      <m:oMath>
+        <m:r>
+          <m:t>γ</m:t>
+        </m:r>
+      </m:oMath>
+      <w:r>
+        <w:t xml:space="preserve">. ¿Es apreciable la diferencia con</w:t>
+      </w:r>
+      <w:r>
+        <w:t xml:space="preserve"> </w:t>
+      </w:r>
+      <m:oMath>
+        <m:sSub>
+          <m:e>
+            <m:r>
+              <m:t>T</m:t>
+            </m:r>
+          </m:e>
+          <m:sub>
+            <m:r>
+              <m:t>0</m:t>
+            </m:r>
+          </m:sub>
+        </m:sSub>
+      </m:oMath>
+      <w:r>
         <w:t xml:space="preserve">?</w:t>
       </w:r>
     </w:p>
@@ -4245,7 +5076,78 @@
       </w:tr>
     </w:tbl>
     <w:p/>
-    <w:bookmarkEnd w:id="28"/>
+    <w:p>
+      <w:pPr>
+        <w:pStyle w:val="BodyText"/>
+        <w:jc w:val="both"/>
+      </w:pPr>
+      <w:r>
+        <w:rPr>
+          <w:bCs/>
+          <w:b/>
+        </w:rPr>
+        <w:t xml:space="preserve">5.</w:t>
+      </w:r>
+      <w:r>
+        <w:t xml:space="preserve"> </w:t>
+      </w:r>
+      <w:r>
+        <w:t xml:space="preserve">El freno no debe alimentarse con más de 1 A. ¿Cómo se comportaría el péndulo si, por ejemplo,</w:t>
+      </w:r>
+      <w:r>
+        <w:t xml:space="preserve"> </w:t>
+      </w:r>
+      <m:oMath>
+        <m:sSub>
+          <m:e>
+            <m:r>
+              <m:t>I</m:t>
+            </m:r>
+          </m:e>
+          <m:sub>
+            <m:r>
+              <m:t>B</m:t>
+            </m:r>
+          </m:sub>
+        </m:sSub>
+      </m:oMath>
+      <w:r>
+        <w:t xml:space="preserve"> </w:t>
+      </w:r>
+      <w:r>
+        <w:t xml:space="preserve">= 2 A? Razone qué régimen de amortiguamiento esperaría.</w:t>
+      </w:r>
+    </w:p>
+    <w:tbl>
+      <w:tblPr>
+        <w:tblW w:type="pct" w:w="5000"/>
+        <w:tblBorders>
+          <w:top w:val="single" w:sz="6" w:color="000000"/>
+          <w:left w:val="single" w:sz="6" w:color="000000"/>
+          <w:bottom w:val="single" w:sz="6" w:color="000000"/>
+          <w:right w:val="single" w:sz="6" w:color="000000"/>
+          <w:insideH w:val="single" w:sz="6" w:color="000000"/>
+          <w:insideV w:val="single" w:sz="6" w:color="000000"/>
+        </w:tblBorders>
+        <w:tblLook w:firstColumn="1" w:firstRow="1" w:lastColumn="0" w:lastRow="0" w:noHBand="0" w:noVBand="1" w:val="04A0"/>
+      </w:tblPr>
+      <w:tblGrid>
+        <w:gridCol w:w="9524"/>
+      </w:tblGrid>
+      <w:tr>
+        <w:trPr>
+          <w:trHeight w:val="1134" w:hRule="atLeast"/>
+        </w:trPr>
+        <w:tc>
+          <w:tcPr>
+            <w:tcW w:type="dxa" w:w="9524"/>
+          </w:tcPr>
+          <w:p/>
+        </w:tc>
+      </w:tr>
+    </w:tbl>
+    <w:p/>
+    <w:bookmarkEnd w:id="31"/>
     <w:sectPr>
       <w:headerReference w:type="default" r:id="rId9"/>
       <w:footerReference w:type="default" r:id="rId10"/>

</xml_diff>

<commit_message>
Fichas Pohl con la notación de los apuntes (x, x_n, delta, x_max, omega_pico)
Co-Authored-By: Claude Opus 5.5 <noreply@anthropic.com>
Claude-Session: https://claude.ai/code/session_01GdrGkTkQ1SpY6BWmf3EBwF
</commit_message>
<xml_diff>
--- a/fichas/fai-pohl-amortiguadas.docx
+++ b/fichas/fai-pohl-amortiguadas.docx
@@ -43,7 +43,7 @@
         <w:jc w:val="both"/>
       </w:pPr>
       <w:r>
-        <w:t xml:space="preserve">Medir el periodo propio del péndulo de Pohl y estudiar cómo se apagan sus oscilaciones cuando se frena la rueda con un electroimán. A partir de cómo disminuye la amplitud se obtiene el ritmo de amortiguamiento para tres tensiones del freno.</w:t>
+        <w:t xml:space="preserve">Medir el periodo propio del péndulo de Pohl y ver cómo se apagan sus oscilaciones cuando se frena la rueda con un electroimán. De la disminución de la amplitud se obtienen el decremento logarítmico, el ritmo de amortiguamiento y el factor de calidad para tres tensiones del freno.</w:t>
       </w:r>
     </w:p>
     <w:bookmarkEnd w:id="21"/>
@@ -71,21 +71,21 @@
         <w:jc w:val="both"/>
       </w:pPr>
       <w:r>
-        <w:t xml:space="preserve">El péndulo de Pohl es una rueda de cobre unida a un muelle en espiral. Si se gira la rueda un ángulo</w:t>
+        <w:t xml:space="preserve">El péndulo de Pohl es una rueda de cobre unida a un muelle en espiral. Si se gira la rueda y se suelta, oscila alrededor del cero de la escala. Llamamos</w:t>
       </w:r>
       <w:r>
         <w:t xml:space="preserve"> </w:t>
       </w:r>
       <m:oMath>
         <m:r>
-          <m:t>φ</m:t>
+          <m:t>x</m:t>
         </m:r>
       </m:oMath>
       <w:r>
         <w:t xml:space="preserve"> </w:t>
       </w:r>
       <w:r>
-        <w:t xml:space="preserve">y se suelta, el muelle la hace oscilar alrededor del cero de la escala. Junto a la rueda hay un electroimán, el freno, que la frena con más fuerza cuanto más rápido gira. La ecuación del movimiento es</w:t>
+        <w:t xml:space="preserve">a la posición de la flecha sobre la escala, en divisiones. Junto a la rueda hay un electroimán, el freno, que la frena con más fuerza cuanto más rápido gira, y la ecuación del movimiento es la del oscilador amortiguado:</w:t>
       </w:r>
     </w:p>
     <w:p>
@@ -105,7 +105,7 @@
             </m:accPr>
             <m:e>
               <m:r>
-                <m:t>φ</m:t>
+                <m:t>x</m:t>
               </m:r>
             </m:e>
           </m:acc>
@@ -127,7 +127,7 @@
             </m:accPr>
             <m:e>
               <m:r>
-                <m:t>φ</m:t>
+                <m:t>x</m:t>
               </m:r>
             </m:e>
           </m:acc>
@@ -158,7 +158,7 @@
             <m:t> </m:t>
           </m:r>
           <m:r>
-            <m:t>φ</m:t>
+            <m:t>x</m:t>
           </m:r>
           <m:r>
             <m:rPr>
@@ -173,7 +173,7 @@
             <m:rPr>
               <m:sty m:val="p"/>
             </m:rPr>
-            <m:t>,</m:t>
+            <m:t>.</m:t>
           </m:r>
         </m:oMath>
       </m:oMathPara>
@@ -185,7 +185,7 @@
         <w:jc w:val="both"/>
       </w:pPr>
       <w:r>
-        <w:t xml:space="preserve">donde</w:t>
+        <w:t xml:space="preserve">Aquí</w:t>
       </w:r>
       <w:r>
         <w:t xml:space="preserve"> </w:t>
@@ -208,7 +208,7 @@
         <w:t xml:space="preserve"> </w:t>
       </w:r>
       <w:r>
-        <w:t xml:space="preserve">es la frecuencia propia, la que tendría la rueda sin rozamiento, y</w:t>
+        <w:t xml:space="preserve">es la frecuencia propia y</w:t>
       </w:r>
       <w:r>
         <w:t xml:space="preserve"> </w:t>
@@ -222,17 +222,21 @@
         <w:t xml:space="preserve"> </w:t>
       </w:r>
       <w:r>
-        <w:t xml:space="preserve">es el ritmo de amortiguamiento, que aumenta con la corriente del freno.</w:t>
-      </w:r>
-    </w:p>
-    <w:p>
-      <w:pPr>
-        <w:pStyle w:val="BodyText"/>
-        <w:spacing w:after="120" w:line="276" w:lineRule="auto"/>
-        <w:jc w:val="both"/>
-      </w:pPr>
-      <w:r>
-        <w:t xml:space="preserve">Cuando el frenado es débil, la rueda sigue oscilando, pero cada vez con menos amplitud, como en la Figura 1:</w:t>
+        <w:t xml:space="preserve">el ritmo de amortiguamiento, que crece con la corriente del freno. Con el freno que usaremos el régimen es subamortiguado: la rueda oscila con periodo</w:t>
+      </w:r>
+      <w:r>
+        <w:t xml:space="preserve"> </w:t>
+      </w:r>
+      <m:oMath>
+        <m:r>
+          <m:t>T</m:t>
+        </m:r>
+      </m:oMath>
+      <w:r>
+        <w:t xml:space="preserve"> </w:t>
+      </w:r>
+      <w:r>
+        <w:t xml:space="preserve">y amplitud decreciente (Figura 1),</w:t>
       </w:r>
     </w:p>
     <w:p>
@@ -247,7 +251,7 @@
         </m:oMathParaPr>
         <m:oMath>
           <m:r>
-            <m:t>φ</m:t>
+            <m:t>x</m:t>
           </m:r>
           <m:d>
             <m:dPr>
@@ -268,18 +272,9 @@
             </m:rPr>
             <m:t>=</m:t>
           </m:r>
-          <m:sSub>
-            <m:e>
-              <m:r>
-                <m:t>φ</m:t>
-              </m:r>
-            </m:e>
-            <m:sub>
-              <m:r>
-                <m:t>0</m:t>
-              </m:r>
-            </m:sub>
-          </m:sSub>
+          <m:r>
+            <m:t>A</m:t>
+          </m:r>
           <m:r>
             <m:t> </m:t>
           </m:r>
@@ -319,12 +314,31 @@
             </m:rPr>
             <m:t>cos</m:t>
           </m:r>
-          <m:r>
-            <m:t>ω</m:t>
-          </m:r>
-          <m:r>
-            <m:t>t</m:t>
-          </m:r>
+          <m:d>
+            <m:dPr>
+              <m:begChr m:val="("/>
+              <m:endChr m:val=")"/>
+              <m:sepChr m:val=""/>
+              <m:grow/>
+            </m:dPr>
+            <m:e>
+              <m:r>
+                <m:t>ω</m:t>
+              </m:r>
+              <m:r>
+                <m:t>t</m:t>
+              </m:r>
+              <m:r>
+                <m:rPr>
+                  <m:sty m:val="p"/>
+                </m:rPr>
+                <m:t>+</m:t>
+              </m:r>
+              <m:r>
+                <m:t>φ</m:t>
+              </m:r>
+            </m:e>
+          </m:d>
           <m:r>
             <m:rPr>
               <m:sty m:val="p"/>
@@ -342,9 +356,9 @@
       <w:r>
         <w:drawing>
           <wp:inline>
-            <wp:extent cx="5039999" cy="2742486"/>
+            <wp:extent cx="5039999" cy="2733405"/>
             <wp:effectExtent b="0" l="0" r="0" t="0"/>
-            <wp:docPr descr="Figura 1. Oscilación amortiguada. Los puntos son los extremos que se leen en la escala." title="" id="23" name="Picture"/>
+            <wp:docPr descr="Figura 1. Oscilación subamortiguada y máximos sucesivos." title="" id="23" name="Picture"/>
             <a:graphic>
               <a:graphicData uri="http://schemas.openxmlformats.org/drawingml/2006/picture">
                 <pic:pic>
@@ -363,7 +377,7 @@
                   <pic:spPr bwMode="auto">
                     <a:xfrm>
                       <a:off x="0" y="0"/>
-                      <a:ext cx="5039999" cy="2742486"/>
+                      <a:ext cx="5039999" cy="2733405"/>
                     </a:xfrm>
                     <a:prstGeom prst="rect">
                       <a:avLst/>
@@ -388,7 +402,7 @@
         <w:jc w:val="center"/>
       </w:pPr>
       <w:r>
-        <w:t xml:space="preserve">Figura 1. Oscilación amortiguada. Los puntos son los extremos que se leen en la escala.</w:t>
+        <w:t xml:space="preserve">Figura 1. Oscilación subamortiguada y máximos sucesivos.</w:t>
       </w:r>
     </w:p>
     <w:p>
@@ -398,7 +412,7 @@
         <w:jc w:val="both"/>
       </w:pPr>
       <w:r>
-        <w:t xml:space="preserve">No hace falta seguir todo el movimiento. Basta con leer en la escala hasta dónde llega la flecha en cada extremo de la oscilación, los puntos de la Figura 1. Los extremos se suceden cada medio periodo, uno a cada lado del cero, en los instantes</w:t>
+        <w:t xml:space="preserve">Basta con leer en la escala los máximos sucesivos a un mismo lado del cero,</w:t>
       </w:r>
       <w:r>
         <w:t xml:space="preserve"> </w:t>
@@ -407,60 +421,7 @@
         <m:sSub>
           <m:e>
             <m:r>
-              <m:t>t</m:t>
-            </m:r>
-          </m:e>
-          <m:sub>
-            <m:r>
-              <m:t>k</m:t>
-            </m:r>
-          </m:sub>
-        </m:sSub>
-        <m:r>
-          <m:rPr>
-            <m:sty m:val="p"/>
-          </m:rPr>
-          <m:t>=</m:t>
-        </m:r>
-        <m:r>
-          <m:t>k</m:t>
-        </m:r>
-        <m:r>
-          <m:t> </m:t>
-        </m:r>
-        <m:sSub>
-          <m:e>
-            <m:r>
-              <m:t>T</m:t>
-            </m:r>
-          </m:e>
-          <m:sub>
-            <m:r>
-              <m:t>0</m:t>
-            </m:r>
-          </m:sub>
-        </m:sSub>
-        <m:r>
-          <m:rPr>
-            <m:sty m:val="p"/>
-          </m:rPr>
-          <m:t>/</m:t>
-        </m:r>
-        <m:r>
-          <m:t>2</m:t>
-        </m:r>
-      </m:oMath>
-      <w:r>
-        <w:t xml:space="preserve">, y sus amplitudes</w:t>
-      </w:r>
-      <w:r>
-        <w:t xml:space="preserve"> </w:t>
-      </w:r>
-      <m:oMath>
-        <m:sSub>
-          <m:e>
-            <m:r>
-              <m:t>φ</m:t>
+              <m:t>x</m:t>
             </m:r>
           </m:e>
           <m:sub>
@@ -478,7 +439,7 @@
         <m:sSub>
           <m:e>
             <m:r>
-              <m:t>φ</m:t>
+              <m:t>x</m:t>
             </m:r>
           </m:e>
           <m:sub>
@@ -496,7 +457,7 @@
         <m:sSub>
           <m:e>
             <m:r>
-              <m:t>φ</m:t>
+              <m:t>x</m:t>
             </m:r>
           </m:e>
           <m:sub>
@@ -519,10 +480,167 @@
         </m:r>
       </m:oMath>
       <w:r>
-        <w:t xml:space="preserve"> </w:t>
-      </w:r>
-      <w:r>
-        <w:t xml:space="preserve">siguen la curva discontinua</w:t>
+        <w:t xml:space="preserve">, separados un periodo</w:t>
+      </w:r>
+      <w:r>
+        <w:t xml:space="preserve"> </w:t>
+      </w:r>
+      <m:oMath>
+        <m:r>
+          <m:t>T</m:t>
+        </m:r>
+      </m:oMath>
+      <w:r>
+        <w:t xml:space="preserve">. Cada máximo es el anterior multiplicado por el mismo factor</w:t>
+      </w:r>
+      <w:r>
+        <w:t xml:space="preserve"> </w:t>
+      </w:r>
+      <m:oMath>
+        <m:sSup>
+          <m:e>
+            <m:r>
+              <m:t>e</m:t>
+            </m:r>
+          </m:e>
+          <m:sup>
+            <m:r>
+              <m:rPr>
+                <m:sty m:val="p"/>
+              </m:rPr>
+              <m:t>−</m:t>
+            </m:r>
+            <m:r>
+              <m:t>γ</m:t>
+            </m:r>
+            <m:r>
+              <m:t>T</m:t>
+            </m:r>
+            <m:r>
+              <m:rPr>
+                <m:sty m:val="p"/>
+              </m:rPr>
+              <m:t>/</m:t>
+            </m:r>
+            <m:r>
+              <m:t>2</m:t>
+            </m:r>
+          </m:sup>
+        </m:sSup>
+      </m:oMath>
+      <w:r>
+        <w:t xml:space="preserve">, así que el cociente entre dos máximos consecutivos es constante. Su logaritmo es el decremento logarítmico:</w:t>
+      </w:r>
+    </w:p>
+    <w:p>
+      <w:pPr>
+        <w:pStyle w:val="BodyText"/>
+        <w:spacing w:after="120" w:line="276" w:lineRule="auto"/>
+        <w:jc w:val="both"/>
+      </w:pPr>
+      <m:oMathPara>
+        <m:oMathParaPr>
+          <m:jc m:val="center"/>
+        </m:oMathParaPr>
+        <m:oMath>
+          <m:r>
+            <m:t>δ</m:t>
+          </m:r>
+          <m:r>
+            <m:rPr>
+              <m:sty m:val="p"/>
+            </m:rPr>
+            <m:t>=</m:t>
+          </m:r>
+          <m:r>
+            <m:rPr>
+              <m:sty m:val="p"/>
+            </m:rPr>
+            <m:t>ln</m:t>
+          </m:r>
+          <m:f>
+            <m:fPr>
+              <m:type m:val="bar"/>
+            </m:fPr>
+            <m:num>
+              <m:sSub>
+                <m:e>
+                  <m:r>
+                    <m:t>x</m:t>
+                  </m:r>
+                </m:e>
+                <m:sub>
+                  <m:r>
+                    <m:t>n</m:t>
+                  </m:r>
+                </m:sub>
+              </m:sSub>
+            </m:num>
+            <m:den>
+              <m:sSub>
+                <m:e>
+                  <m:r>
+                    <m:t>x</m:t>
+                  </m:r>
+                </m:e>
+                <m:sub>
+                  <m:r>
+                    <m:t>n</m:t>
+                  </m:r>
+                  <m:r>
+                    <m:rPr>
+                      <m:sty m:val="p"/>
+                    </m:rPr>
+                    <m:t>+</m:t>
+                  </m:r>
+                  <m:r>
+                    <m:t>1</m:t>
+                  </m:r>
+                </m:sub>
+              </m:sSub>
+            </m:den>
+          </m:f>
+          <m:r>
+            <m:rPr>
+              <m:sty m:val="p"/>
+            </m:rPr>
+            <m:t>=</m:t>
+          </m:r>
+          <m:f>
+            <m:fPr>
+              <m:type m:val="bar"/>
+            </m:fPr>
+            <m:num>
+              <m:r>
+                <m:t>γ</m:t>
+              </m:r>
+              <m:r>
+                <m:t>T</m:t>
+              </m:r>
+            </m:num>
+            <m:den>
+              <m:r>
+                <m:t>2</m:t>
+              </m:r>
+            </m:den>
+          </m:f>
+          <m:r>
+            <m:rPr>
+              <m:sty m:val="p"/>
+            </m:rPr>
+            <m:t>.</m:t>
+          </m:r>
+        </m:oMath>
+      </m:oMathPara>
+    </w:p>
+    <w:p>
+      <w:pPr>
+        <w:pStyle w:val="FirstParagraph"/>
+        <w:spacing w:after="120" w:line="276" w:lineRule="auto"/>
+        <w:jc w:val="both"/>
+      </w:pPr>
+      <w:r>
+        <w:t xml:space="preserve">Por tanto</w:t>
       </w:r>
       <w:r>
         <w:t xml:space="preserve"> </w:t>
@@ -531,12 +649,12 @@
         <m:sSub>
           <m:e>
             <m:r>
-              <m:t>φ</m:t>
+              <m:t>x</m:t>
             </m:r>
           </m:e>
           <m:sub>
             <m:r>
-              <m:t>k</m:t>
+              <m:t>n</m:t>
             </m:r>
           </m:sub>
         </m:sSub>
@@ -549,7 +667,7 @@
         <m:sSub>
           <m:e>
             <m:r>
-              <m:t>φ</m:t>
+              <m:t>x</m:t>
             </m:r>
           </m:e>
           <m:sub>
@@ -575,34 +693,19 @@
               <m:t>−</m:t>
             </m:r>
             <m:r>
-              <m:t>γ</m:t>
-            </m:r>
-            <m:sSub>
-              <m:e>
-                <m:r>
-                  <m:t>t</m:t>
-                </m:r>
-              </m:e>
-              <m:sub>
-                <m:r>
-                  <m:t>k</m:t>
-                </m:r>
-              </m:sub>
-            </m:sSub>
-            <m:r>
-              <m:rPr>
-                <m:sty m:val="p"/>
-              </m:rPr>
-              <m:t>/</m:t>
-            </m:r>
-            <m:r>
-              <m:t>2</m:t>
+              <m:t>δ</m:t>
+            </m:r>
+            <m:r>
+              <m:t>n</m:t>
             </m:r>
           </m:sup>
         </m:sSup>
       </m:oMath>
       <w:r>
-        <w:t xml:space="preserve">. Tomando logaritmos,</w:t>
+        <w:t xml:space="preserve"> </w:t>
+      </w:r>
+      <w:r>
+        <w:t xml:space="preserve">y, tomando logaritmos,</w:t>
       </w:r>
     </w:p>
     <w:p>
@@ -625,12 +728,12 @@
           <m:sSub>
             <m:e>
               <m:r>
-                <m:t>φ</m:t>
+                <m:t>x</m:t>
               </m:r>
             </m:e>
             <m:sub>
               <m:r>
-                <m:t>k</m:t>
+                <m:t>n</m:t>
               </m:r>
             </m:sub>
           </m:sSub>
@@ -649,7 +752,7 @@
           <m:sSub>
             <m:e>
               <m:r>
-                <m:t>φ</m:t>
+                <m:t>x</m:t>
               </m:r>
             </m:e>
             <m:sub>
@@ -664,36 +767,15 @@
             </m:rPr>
             <m:t>−</m:t>
           </m:r>
-          <m:f>
-            <m:fPr>
-              <m:type m:val="bar"/>
-            </m:fPr>
-            <m:num>
-              <m:r>
-                <m:t>γ</m:t>
-              </m:r>
-            </m:num>
-            <m:den>
-              <m:r>
-                <m:t>2</m:t>
-              </m:r>
-            </m:den>
-          </m:f>
+          <m:r>
+            <m:t>δ</m:t>
+          </m:r>
           <m:r>
             <m:t> </m:t>
           </m:r>
-          <m:sSub>
-            <m:e>
-              <m:r>
-                <m:t>t</m:t>
-              </m:r>
-            </m:e>
-            <m:sub>
-              <m:r>
-                <m:t>k</m:t>
-              </m:r>
-            </m:sub>
-          </m:sSub>
+          <m:r>
+            <m:t>n</m:t>
+          </m:r>
           <m:r>
             <m:rPr>
               <m:sty m:val="p"/>
@@ -710,7 +792,7 @@
         <w:jc w:val="both"/>
       </w:pPr>
       <w:r>
-        <w:t xml:space="preserve">Por tanto, al representar</w:t>
+        <w:t xml:space="preserve">Al representar</w:t>
       </w:r>
       <w:r>
         <w:t xml:space="preserve"> </w:t>
@@ -725,12 +807,12 @@
         <m:sSub>
           <m:e>
             <m:r>
-              <m:t>φ</m:t>
+              <m:t>x</m:t>
             </m:r>
           </m:e>
           <m:sub>
             <m:r>
-              <m:t>k</m:t>
+              <m:t>n</m:t>
             </m:r>
           </m:sub>
         </m:sSub>
@@ -745,38 +827,20 @@
         <w:t xml:space="preserve"> </w:t>
       </w:r>
       <m:oMath>
-        <m:sSub>
-          <m:e>
-            <m:r>
-              <m:t>t</m:t>
-            </m:r>
-          </m:e>
-          <m:sub>
-            <m:r>
-              <m:t>k</m:t>
-            </m:r>
-          </m:sub>
-        </m:sSub>
+        <m:r>
+          <m:t>n</m:t>
+        </m:r>
       </m:oMath>
       <w:r>
         <w:t xml:space="preserve"> </w:t>
       </w:r>
       <w:r>
-        <w:t xml:space="preserve">los puntos forman una recta, y de su pendiente</w:t>
+        <w:t xml:space="preserve">los puntos forman una recta de pendiente</w:t>
       </w:r>
       <w:r>
         <w:t xml:space="preserve"> </w:t>
       </w:r>
       <m:oMath>
-        <m:r>
-          <m:t>a</m:t>
-        </m:r>
-        <m:r>
-          <m:rPr>
-            <m:sty m:val="p"/>
-          </m:rPr>
-          <m:t>=</m:t>
-        </m:r>
         <m:r>
           <m:rPr>
             <m:sty m:val="p"/>
@@ -784,23 +848,25 @@
           <m:t>−</m:t>
         </m:r>
         <m:r>
-          <m:t>γ</m:t>
-        </m:r>
-        <m:r>
-          <m:rPr>
-            <m:sty m:val="p"/>
-          </m:rPr>
-          <m:t>/</m:t>
-        </m:r>
-        <m:r>
-          <m:t>2</m:t>
+          <m:t>δ</m:t>
         </m:r>
       </m:oMath>
       <w:r>
-        <w:t xml:space="preserve"> </w:t>
-      </w:r>
-      <w:r>
-        <w:t xml:space="preserve">se obtiene el ritmo de amortiguamiento,</w:t>
+        <w:t xml:space="preserve">. A partir de</w:t>
+      </w:r>
+      <w:r>
+        <w:t xml:space="preserve"> </w:t>
+      </w:r>
+      <m:oMath>
+        <m:r>
+          <m:t>δ</m:t>
+        </m:r>
+      </m:oMath>
+      <w:r>
+        <w:t xml:space="preserve"> </w:t>
+      </w:r>
+      <w:r>
+        <w:t xml:space="preserve">se calculan el ritmo de amortiguamiento,</w:t>
       </w:r>
       <w:r>
         <w:t xml:space="preserve"> </w:t>
@@ -816,20 +882,23 @@
           <m:t>=</m:t>
         </m:r>
         <m:r>
+          <m:t>2</m:t>
+        </m:r>
+        <m:r>
+          <m:t>δ</m:t>
+        </m:r>
+        <m:r>
           <m:rPr>
             <m:sty m:val="p"/>
           </m:rPr>
-          <m:t>−</m:t>
+          <m:t>/</m:t>
         </m:r>
         <m:r>
-          <m:t>2</m:t>
-        </m:r>
-        <m:r>
-          <m:t>a</m:t>
+          <m:t>T</m:t>
         </m:r>
       </m:oMath>
       <w:r>
-        <w:t xml:space="preserve">. Con él se calcula el factor de calidad,</w:t>
+        <w:t xml:space="preserve">, y el factor de calidad,</w:t>
       </w:r>
       <w:r>
         <w:t xml:space="preserve"> </w:t>
@@ -867,18 +936,41 @@
         </m:r>
       </m:oMath>
       <w:r>
-        <w:t xml:space="preserve">: cuanto mayor es</w:t>
+        <w:t xml:space="preserve">. Como el amortiguamiento es débil,</w:t>
       </w:r>
       <w:r>
         <w:t xml:space="preserve"> </w:t>
       </w:r>
       <m:oMath>
         <m:r>
-          <m:t>Q</m:t>
+          <m:t>T</m:t>
         </m:r>
       </m:oMath>
       <w:r>
-        <w:t xml:space="preserve">, más oscilaciones da la rueda antes de pararse.</w:t>
+        <w:t xml:space="preserve"> </w:t>
+      </w:r>
+      <w:r>
+        <w:t xml:space="preserve">es prácticamente igual al periodo propio</w:t>
+      </w:r>
+      <w:r>
+        <w:t xml:space="preserve"> </w:t>
+      </w:r>
+      <m:oMath>
+        <m:sSub>
+          <m:e>
+            <m:r>
+              <m:t>T</m:t>
+            </m:r>
+          </m:e>
+          <m:sub>
+            <m:r>
+              <m:t>0</m:t>
+            </m:r>
+          </m:sub>
+        </m:sSub>
+      </m:oMath>
+      <w:r>
+        <w:t xml:space="preserve">.</w:t>
       </w:r>
     </w:p>
     <w:bookmarkEnd w:id="25"/>
@@ -1069,7 +1161,7 @@
         </m:sSub>
       </m:oMath>
       <w:r>
-        <w:t xml:space="preserve">. Repetir la medida cinco veces. El periodo es</w:t>
+        <w:t xml:space="preserve">. Repetir la medida cinco veces. El periodo propio es</w:t>
       </w:r>
       <w:r>
         <w:t xml:space="preserve"> </w:t>
@@ -1788,7 +1880,7 @@
         <w:t xml:space="preserve"> </w:t>
       </w:r>
       <w:r>
-        <w:t xml:space="preserve">en la última fila de la Tabla 2. Girar la rueda hasta 15 divisiones, que es</w:t>
+        <w:t xml:space="preserve">en la última fila de la Tabla 2. Girar la rueda hacia la derecha hasta 15 divisiones, que es</w:t>
       </w:r>
       <w:r>
         <w:t xml:space="preserve"> </w:t>
@@ -1797,7 +1889,7 @@
         <m:sSub>
           <m:e>
             <m:r>
-              <m:t>φ</m:t>
+              <m:t>x</m:t>
             </m:r>
           </m:e>
           <m:sub>
@@ -1808,7 +1900,7 @@
         </m:sSub>
       </m:oMath>
       <w:r>
-        <w:t xml:space="preserve">, y soltarla. Leer la amplitud de cada extremo, primero a un lado del cero y luego al otro, como en la Figura 1, y anotarla sin signo. Seguir hasta que la amplitud sea menor que 1 división. Es más fácil entre dos: uno sigue la flecha y canta el número y el otro lo apunta. Repetir con</w:t>
+        <w:t xml:space="preserve">, y soltarla. Leer los máximos sucesivos a la derecha,</w:t>
       </w:r>
       <w:r>
         <w:t xml:space="preserve"> </w:t>
@@ -1817,59 +1909,12 @@
         <m:sSub>
           <m:e>
             <m:r>
-              <m:t>V</m:t>
+              <m:t>x</m:t>
             </m:r>
           </m:e>
           <m:sub>
             <m:r>
-              <m:t>B</m:t>
-            </m:r>
-          </m:sub>
-        </m:sSub>
-      </m:oMath>
-      <w:r>
-        <w:t xml:space="preserve"> </w:t>
-      </w:r>
-      <w:r>
-        <w:t xml:space="preserve">= 6 V y 8 V.</w:t>
-      </w:r>
-    </w:p>
-    <w:p>
-      <w:pPr>
-        <w:pStyle w:val="BodyText"/>
-        <w:spacing w:after="120" w:line="276" w:lineRule="auto"/>
-        <w:jc w:val="both"/>
-      </w:pPr>
-      <w:r>
-        <w:t xml:space="preserve">Los tiempos no se miden: el extremo</w:t>
-      </w:r>
-      <w:r>
-        <w:t xml:space="preserve"> </w:t>
-      </w:r>
-      <m:oMath>
-        <m:r>
-          <m:t>k</m:t>
-        </m:r>
-      </m:oMath>
-      <w:r>
-        <w:t xml:space="preserve"> </w:t>
-      </w:r>
-      <w:r>
-        <w:t xml:space="preserve">ocurre en</w:t>
-      </w:r>
-      <w:r>
-        <w:t xml:space="preserve"> </w:t>
-      </w:r>
-      <m:oMath>
-        <m:sSub>
-          <m:e>
-            <m:r>
-              <m:t>t</m:t>
-            </m:r>
-          </m:e>
-          <m:sub>
-            <m:r>
-              <m:t>k</m:t>
+              <m:t>1</m:t>
             </m:r>
           </m:sub>
         </m:sSub>
@@ -1877,23 +1922,17 @@
           <m:rPr>
             <m:sty m:val="p"/>
           </m:rPr>
-          <m:t>=</m:t>
-        </m:r>
-        <m:r>
-          <m:t>k</m:t>
-        </m:r>
-        <m:r>
-          <m:t> </m:t>
+          <m:t>,</m:t>
         </m:r>
         <m:sSub>
           <m:e>
             <m:r>
-              <m:t>T</m:t>
+              <m:t>x</m:t>
             </m:r>
           </m:e>
           <m:sub>
             <m:r>
-              <m:t>0</m:t>
+              <m:t>2</m:t>
             </m:r>
           </m:sub>
         </m:sSub>
@@ -1901,14 +1940,17 @@
           <m:rPr>
             <m:sty m:val="p"/>
           </m:rPr>
-          <m:t>/</m:t>
+          <m:t>,</m:t>
         </m:r>
         <m:r>
-          <m:t>2</m:t>
+          <m:rPr>
+            <m:sty m:val="p"/>
+          </m:rPr>
+          <m:t>…</m:t>
         </m:r>
       </m:oMath>
       <w:r>
-        <w:t xml:space="preserve">, con el</w:t>
+        <w:t xml:space="preserve">, hasta que sean menores que 1 división. Es más fácil entre dos: uno sigue la flecha y canta el número y el otro lo apunta. Repetir con</w:t>
       </w:r>
       <w:r>
         <w:t xml:space="preserve"> </w:t>
@@ -1917,12 +1959,12 @@
         <m:sSub>
           <m:e>
             <m:r>
-              <m:t>T</m:t>
+              <m:t>V</m:t>
             </m:r>
           </m:e>
           <m:sub>
             <m:r>
-              <m:t>0</m:t>
+              <m:t>B</m:t>
             </m:r>
           </m:sub>
         </m:sSub>
@@ -1931,7 +1973,7 @@
         <w:t xml:space="preserve"> </w:t>
       </w:r>
       <w:r>
-        <w:t xml:space="preserve">de la Parte A.</w:t>
+        <w:t xml:space="preserve">= 6 V y 8 V.</w:t>
       </w:r>
     </w:p>
     <w:p>
@@ -1942,7 +1984,7 @@
         <w:jc w:val="center"/>
       </w:pPr>
       <w:r>
-        <w:t xml:space="preserve">Tabla 2. Amplitudes de los extremos sucesivos, en divisiones.</w:t>
+        <w:t xml:space="preserve">Tabla 2. Máximos sucesivos, en divisiones.</w:t>
       </w:r>
     </w:p>
     <w:tbl>
@@ -1958,17 +2000,16 @@
           <w:insideV w:val="single" w:sz="6" w:color="000000"/>
         </w:tblBorders>
         <w:tblLook w:firstRow="1" w:lastRow="0" w:firstColumn="0" w:lastColumn="0" w:noHBand="0" w:noVBand="0" w:val="0020"/>
-        <w:tblCaption w:val="Tabla 2. Amplitudes de los extremos sucesivos, en divisiones."/>
+        <w:tblCaption w:val="Tabla 2. Máximos sucesivos, en divisiones."/>
       </w:tblPr>
       <w:tblGrid>
-        <w:gridCol w:w="990"/>
-        <w:gridCol w:w="990"/>
-        <w:gridCol w:w="990"/>
-        <w:gridCol w:w="990"/>
-        <w:gridCol w:w="990"/>
-        <w:gridCol w:w="990"/>
-        <w:gridCol w:w="990"/>
-        <w:gridCol w:w="990"/>
+        <w:gridCol w:w="1131"/>
+        <w:gridCol w:w="1131"/>
+        <w:gridCol w:w="1131"/>
+        <w:gridCol w:w="1131"/>
+        <w:gridCol w:w="1131"/>
+        <w:gridCol w:w="1131"/>
+        <w:gridCol w:w="1131"/>
       </w:tblGrid>
       <w:tr>
         <w:trPr>
@@ -1987,7 +2028,7 @@
             </w:pPr>
             <m:oMath>
               <m:r>
-                <m:t>k</m:t>
+                <m:t>n</m:t>
               </m:r>
             </m:oMath>
           </w:p>
@@ -2006,50 +2047,12 @@
               <m:sSub>
                 <m:e>
                   <m:r>
-                    <m:t>t</m:t>
+                    <m:t>x</m:t>
                   </m:r>
                 </m:e>
                 <m:sub>
                   <m:r>
-                    <m:t>k</m:t>
-                  </m:r>
-                </m:sub>
-              </m:sSub>
-            </m:oMath>
-            <w:r>
-              <w:rPr>
-                <w:sz w:val="20"/>
-              </w:rPr>
-              <w:t xml:space="preserve"> </w:t>
-            </w:r>
-            <w:r>
-              <w:rPr>
-                <w:sz w:val="20"/>
-              </w:rPr>
-              <w:t xml:space="preserve">(s)</w:t>
-            </w:r>
-          </w:p>
-        </w:tc>
-        <w:tc>
-          <w:tcPr>
-            <w:shd w:val="clear" w:color="auto" w:fill="FFF0C1"/>
-            <w:vAlign w:val="center"/>
-          </w:tcPr>
-          <w:p>
-            <w:pPr>
-              <w:pStyle w:val="Compact"/>
-              <w:jc w:val="center"/>
-            </w:pPr>
-            <m:oMath>
-              <m:sSub>
-                <m:e>
-                  <m:r>
-                    <m:t>φ</m:t>
-                  </m:r>
-                </m:e>
-                <m:sub>
-                  <m:r>
-                    <m:t>k</m:t>
+                    <m:t>n</m:t>
                   </m:r>
                 </m:sub>
               </m:sSub>
@@ -2088,12 +2091,12 @@
               <m:sSub>
                 <m:e>
                   <m:r>
-                    <m:t>φ</m:t>
+                    <m:t>x</m:t>
                   </m:r>
                 </m:e>
                 <m:sub>
                   <m:r>
-                    <m:t>k</m:t>
+                    <m:t>n</m:t>
                   </m:r>
                 </m:sub>
               </m:sSub>
@@ -2126,12 +2129,12 @@
               <m:sSub>
                 <m:e>
                   <m:r>
-                    <m:t>φ</m:t>
+                    <m:t>x</m:t>
                   </m:r>
                 </m:e>
                 <m:sub>
                   <m:r>
-                    <m:t>k</m:t>
+                    <m:t>n</m:t>
                   </m:r>
                 </m:sub>
               </m:sSub>
@@ -2170,12 +2173,12 @@
               <m:sSub>
                 <m:e>
                   <m:r>
-                    <m:t>φ</m:t>
+                    <m:t>x</m:t>
                   </m:r>
                 </m:e>
                 <m:sub>
                   <m:r>
-                    <m:t>k</m:t>
+                    <m:t>n</m:t>
                   </m:r>
                 </m:sub>
               </m:sSub>
@@ -2208,12 +2211,12 @@
               <m:sSub>
                 <m:e>
                   <m:r>
-                    <m:t>φ</m:t>
+                    <m:t>x</m:t>
                   </m:r>
                 </m:e>
                 <m:sub>
                   <m:r>
-                    <m:t>k</m:t>
+                    <m:t>n</m:t>
                   </m:r>
                 </m:sub>
               </m:sSub>
@@ -2252,12 +2255,12 @@
               <m:sSub>
                 <m:e>
                   <m:r>
-                    <m:t>φ</m:t>
+                    <m:t>x</m:t>
                   </m:r>
                 </m:e>
                 <m:sub>
                   <m:r>
-                    <m:t>k</m:t>
+                    <m:t>n</m:t>
                   </m:r>
                 </m:sub>
               </m:sSub>
@@ -2400,23 +2403,6 @@
             </w:r>
           </w:p>
         </w:tc>
-        <w:tc>
-          <w:tcPr>
-            <w:vAlign w:val="center"/>
-          </w:tcPr>
-          <w:p>
-            <w:pPr>
-              <w:pStyle w:val="Compact"/>
-              <w:jc w:val="center"/>
-            </w:pPr>
-            <w:r>
-              <w:rPr>
-                <w:sz w:val="20"/>
-              </w:rPr>
-              <w:t xml:space="preserve"> </w:t>
-            </w:r>
-          </w:p>
-        </w:tc>
       </w:tr>
       <w:tr>
         <w:trPr>
@@ -2541,23 +2527,6 @@
             </w:r>
           </w:p>
         </w:tc>
-        <w:tc>
-          <w:tcPr>
-            <w:vAlign w:val="center"/>
-          </w:tcPr>
-          <w:p>
-            <w:pPr>
-              <w:pStyle w:val="Compact"/>
-              <w:jc w:val="center"/>
-            </w:pPr>
-            <w:r>
-              <w:rPr>
-                <w:sz w:val="20"/>
-              </w:rPr>
-              <w:t xml:space="preserve"> </w:t>
-            </w:r>
-          </w:p>
-        </w:tc>
       </w:tr>
       <w:tr>
         <w:trPr>
@@ -2682,23 +2651,6 @@
             </w:r>
           </w:p>
         </w:tc>
-        <w:tc>
-          <w:tcPr>
-            <w:vAlign w:val="center"/>
-          </w:tcPr>
-          <w:p>
-            <w:pPr>
-              <w:pStyle w:val="Compact"/>
-              <w:jc w:val="center"/>
-            </w:pPr>
-            <w:r>
-              <w:rPr>
-                <w:sz w:val="20"/>
-              </w:rPr>
-              <w:t xml:space="preserve"> </w:t>
-            </w:r>
-          </w:p>
-        </w:tc>
       </w:tr>
       <w:tr>
         <w:trPr>
@@ -2823,23 +2775,6 @@
             </w:r>
           </w:p>
         </w:tc>
-        <w:tc>
-          <w:tcPr>
-            <w:vAlign w:val="center"/>
-          </w:tcPr>
-          <w:p>
-            <w:pPr>
-              <w:pStyle w:val="Compact"/>
-              <w:jc w:val="center"/>
-            </w:pPr>
-            <w:r>
-              <w:rPr>
-                <w:sz w:val="20"/>
-              </w:rPr>
-              <w:t xml:space="preserve"> </w:t>
-            </w:r>
-          </w:p>
-        </w:tc>
       </w:tr>
       <w:tr>
         <w:trPr>
@@ -2964,23 +2899,6 @@
             </w:r>
           </w:p>
         </w:tc>
-        <w:tc>
-          <w:tcPr>
-            <w:vAlign w:val="center"/>
-          </w:tcPr>
-          <w:p>
-            <w:pPr>
-              <w:pStyle w:val="Compact"/>
-              <w:jc w:val="center"/>
-            </w:pPr>
-            <w:r>
-              <w:rPr>
-                <w:sz w:val="20"/>
-              </w:rPr>
-              <w:t xml:space="preserve"> </w:t>
-            </w:r>
-          </w:p>
-        </w:tc>
       </w:tr>
       <w:tr>
         <w:trPr>
@@ -3105,23 +3023,6 @@
             </w:r>
           </w:p>
         </w:tc>
-        <w:tc>
-          <w:tcPr>
-            <w:vAlign w:val="center"/>
-          </w:tcPr>
-          <w:p>
-            <w:pPr>
-              <w:pStyle w:val="Compact"/>
-              <w:jc w:val="center"/>
-            </w:pPr>
-            <w:r>
-              <w:rPr>
-                <w:sz w:val="20"/>
-              </w:rPr>
-              <w:t xml:space="preserve"> </w:t>
-            </w:r>
-          </w:p>
-        </w:tc>
       </w:tr>
       <w:tr>
         <w:trPr>
@@ -3246,23 +3147,6 @@
             </w:r>
           </w:p>
         </w:tc>
-        <w:tc>
-          <w:tcPr>
-            <w:vAlign w:val="center"/>
-          </w:tcPr>
-          <w:p>
-            <w:pPr>
-              <w:pStyle w:val="Compact"/>
-              <w:jc w:val="center"/>
-            </w:pPr>
-            <w:r>
-              <w:rPr>
-                <w:sz w:val="20"/>
-              </w:rPr>
-              <w:t xml:space="preserve"> </w:t>
-            </w:r>
-          </w:p>
-        </w:tc>
       </w:tr>
       <w:tr>
         <w:trPr>
@@ -3387,23 +3271,6 @@
             </w:r>
           </w:p>
         </w:tc>
-        <w:tc>
-          <w:tcPr>
-            <w:vAlign w:val="center"/>
-          </w:tcPr>
-          <w:p>
-            <w:pPr>
-              <w:pStyle w:val="Compact"/>
-              <w:jc w:val="center"/>
-            </w:pPr>
-            <w:r>
-              <w:rPr>
-                <w:sz w:val="20"/>
-              </w:rPr>
-              <w:t xml:space="preserve"> </w:t>
-            </w:r>
-          </w:p>
-        </w:tc>
       </w:tr>
       <w:tr>
         <w:trPr>
@@ -3528,23 +3395,6 @@
             </w:r>
           </w:p>
         </w:tc>
-        <w:tc>
-          <w:tcPr>
-            <w:vAlign w:val="center"/>
-          </w:tcPr>
-          <w:p>
-            <w:pPr>
-              <w:pStyle w:val="Compact"/>
-              <w:jc w:val="center"/>
-            </w:pPr>
-            <w:r>
-              <w:rPr>
-                <w:sz w:val="20"/>
-              </w:rPr>
-              <w:t xml:space="preserve"> </w:t>
-            </w:r>
-          </w:p>
-        </w:tc>
       </w:tr>
       <w:tr>
         <w:trPr>
@@ -3564,446 +3414,6 @@
                 <w:sz w:val="20"/>
               </w:rPr>
               <w:t xml:space="preserve">9</w:t>
-            </w:r>
-          </w:p>
-        </w:tc>
-        <w:tc>
-          <w:tcPr>
-            <w:vAlign w:val="center"/>
-          </w:tcPr>
-          <w:p>
-            <w:pPr>
-              <w:pStyle w:val="Compact"/>
-              <w:jc w:val="center"/>
-            </w:pPr>
-            <w:r>
-              <w:rPr>
-                <w:sz w:val="20"/>
-              </w:rPr>
-              <w:t xml:space="preserve"> </w:t>
-            </w:r>
-          </w:p>
-        </w:tc>
-        <w:tc>
-          <w:tcPr>
-            <w:vAlign w:val="center"/>
-          </w:tcPr>
-          <w:p>
-            <w:pPr>
-              <w:pStyle w:val="Compact"/>
-              <w:jc w:val="center"/>
-            </w:pPr>
-            <w:r>
-              <w:rPr>
-                <w:sz w:val="20"/>
-              </w:rPr>
-              <w:t xml:space="preserve"> </w:t>
-            </w:r>
-          </w:p>
-        </w:tc>
-        <w:tc>
-          <w:tcPr>
-            <w:vAlign w:val="center"/>
-          </w:tcPr>
-          <w:p>
-            <w:pPr>
-              <w:pStyle w:val="Compact"/>
-              <w:jc w:val="center"/>
-            </w:pPr>
-            <w:r>
-              <w:rPr>
-                <w:sz w:val="20"/>
-              </w:rPr>
-              <w:t xml:space="preserve"> </w:t>
-            </w:r>
-          </w:p>
-        </w:tc>
-        <w:tc>
-          <w:tcPr>
-            <w:vAlign w:val="center"/>
-          </w:tcPr>
-          <w:p>
-            <w:pPr>
-              <w:pStyle w:val="Compact"/>
-              <w:jc w:val="center"/>
-            </w:pPr>
-            <w:r>
-              <w:rPr>
-                <w:sz w:val="20"/>
-              </w:rPr>
-              <w:t xml:space="preserve"> </w:t>
-            </w:r>
-          </w:p>
-        </w:tc>
-        <w:tc>
-          <w:tcPr>
-            <w:vAlign w:val="center"/>
-          </w:tcPr>
-          <w:p>
-            <w:pPr>
-              <w:pStyle w:val="Compact"/>
-              <w:jc w:val="center"/>
-            </w:pPr>
-            <w:r>
-              <w:rPr>
-                <w:sz w:val="20"/>
-              </w:rPr>
-              <w:t xml:space="preserve"> </w:t>
-            </w:r>
-          </w:p>
-        </w:tc>
-        <w:tc>
-          <w:tcPr>
-            <w:vAlign w:val="center"/>
-          </w:tcPr>
-          <w:p>
-            <w:pPr>
-              <w:pStyle w:val="Compact"/>
-              <w:jc w:val="center"/>
-            </w:pPr>
-            <w:r>
-              <w:rPr>
-                <w:sz w:val="20"/>
-              </w:rPr>
-              <w:t xml:space="preserve"> </w:t>
-            </w:r>
-          </w:p>
-        </w:tc>
-        <w:tc>
-          <w:tcPr>
-            <w:vAlign w:val="center"/>
-          </w:tcPr>
-          <w:p>
-            <w:pPr>
-              <w:pStyle w:val="Compact"/>
-              <w:jc w:val="center"/>
-            </w:pPr>
-            <w:r>
-              <w:rPr>
-                <w:sz w:val="20"/>
-              </w:rPr>
-              <w:t xml:space="preserve"> </w:t>
-            </w:r>
-          </w:p>
-        </w:tc>
-      </w:tr>
-      <w:tr>
-        <w:trPr>
-          <w:trHeight w:val="425" w:hRule="atLeast"/>
-        </w:trPr>
-        <w:tc>
-          <w:tcPr>
-            <w:vAlign w:val="center"/>
-          </w:tcPr>
-          <w:p>
-            <w:pPr>
-              <w:pStyle w:val="Compact"/>
-              <w:jc w:val="center"/>
-            </w:pPr>
-            <w:r>
-              <w:rPr>
-                <w:sz w:val="20"/>
-              </w:rPr>
-              <w:t xml:space="preserve">10</w:t>
-            </w:r>
-          </w:p>
-        </w:tc>
-        <w:tc>
-          <w:tcPr>
-            <w:vAlign w:val="center"/>
-          </w:tcPr>
-          <w:p>
-            <w:pPr>
-              <w:pStyle w:val="Compact"/>
-              <w:jc w:val="center"/>
-            </w:pPr>
-            <w:r>
-              <w:rPr>
-                <w:sz w:val="20"/>
-              </w:rPr>
-              <w:t xml:space="preserve"> </w:t>
-            </w:r>
-          </w:p>
-        </w:tc>
-        <w:tc>
-          <w:tcPr>
-            <w:vAlign w:val="center"/>
-          </w:tcPr>
-          <w:p>
-            <w:pPr>
-              <w:pStyle w:val="Compact"/>
-              <w:jc w:val="center"/>
-            </w:pPr>
-            <w:r>
-              <w:rPr>
-                <w:sz w:val="20"/>
-              </w:rPr>
-              <w:t xml:space="preserve"> </w:t>
-            </w:r>
-          </w:p>
-        </w:tc>
-        <w:tc>
-          <w:tcPr>
-            <w:vAlign w:val="center"/>
-          </w:tcPr>
-          <w:p>
-            <w:pPr>
-              <w:pStyle w:val="Compact"/>
-              <w:jc w:val="center"/>
-            </w:pPr>
-            <w:r>
-              <w:rPr>
-                <w:sz w:val="20"/>
-              </w:rPr>
-              <w:t xml:space="preserve"> </w:t>
-            </w:r>
-          </w:p>
-        </w:tc>
-        <w:tc>
-          <w:tcPr>
-            <w:vAlign w:val="center"/>
-          </w:tcPr>
-          <w:p>
-            <w:pPr>
-              <w:pStyle w:val="Compact"/>
-              <w:jc w:val="center"/>
-            </w:pPr>
-            <w:r>
-              <w:rPr>
-                <w:sz w:val="20"/>
-              </w:rPr>
-              <w:t xml:space="preserve"> </w:t>
-            </w:r>
-          </w:p>
-        </w:tc>
-        <w:tc>
-          <w:tcPr>
-            <w:vAlign w:val="center"/>
-          </w:tcPr>
-          <w:p>
-            <w:pPr>
-              <w:pStyle w:val="Compact"/>
-              <w:jc w:val="center"/>
-            </w:pPr>
-            <w:r>
-              <w:rPr>
-                <w:sz w:val="20"/>
-              </w:rPr>
-              <w:t xml:space="preserve"> </w:t>
-            </w:r>
-          </w:p>
-        </w:tc>
-        <w:tc>
-          <w:tcPr>
-            <w:vAlign w:val="center"/>
-          </w:tcPr>
-          <w:p>
-            <w:pPr>
-              <w:pStyle w:val="Compact"/>
-              <w:jc w:val="center"/>
-            </w:pPr>
-            <w:r>
-              <w:rPr>
-                <w:sz w:val="20"/>
-              </w:rPr>
-              <w:t xml:space="preserve"> </w:t>
-            </w:r>
-          </w:p>
-        </w:tc>
-        <w:tc>
-          <w:tcPr>
-            <w:vAlign w:val="center"/>
-          </w:tcPr>
-          <w:p>
-            <w:pPr>
-              <w:pStyle w:val="Compact"/>
-              <w:jc w:val="center"/>
-            </w:pPr>
-            <w:r>
-              <w:rPr>
-                <w:sz w:val="20"/>
-              </w:rPr>
-              <w:t xml:space="preserve"> </w:t>
-            </w:r>
-          </w:p>
-        </w:tc>
-      </w:tr>
-      <w:tr>
-        <w:trPr>
-          <w:trHeight w:val="425" w:hRule="atLeast"/>
-        </w:trPr>
-        <w:tc>
-          <w:tcPr>
-            <w:vAlign w:val="center"/>
-          </w:tcPr>
-          <w:p>
-            <w:pPr>
-              <w:pStyle w:val="Compact"/>
-              <w:jc w:val="center"/>
-            </w:pPr>
-            <w:r>
-              <w:rPr>
-                <w:sz w:val="20"/>
-              </w:rPr>
-              <w:t xml:space="preserve">11</w:t>
-            </w:r>
-          </w:p>
-        </w:tc>
-        <w:tc>
-          <w:tcPr>
-            <w:vAlign w:val="center"/>
-          </w:tcPr>
-          <w:p>
-            <w:pPr>
-              <w:pStyle w:val="Compact"/>
-              <w:jc w:val="center"/>
-            </w:pPr>
-            <w:r>
-              <w:rPr>
-                <w:sz w:val="20"/>
-              </w:rPr>
-              <w:t xml:space="preserve"> </w:t>
-            </w:r>
-          </w:p>
-        </w:tc>
-        <w:tc>
-          <w:tcPr>
-            <w:vAlign w:val="center"/>
-          </w:tcPr>
-          <w:p>
-            <w:pPr>
-              <w:pStyle w:val="Compact"/>
-              <w:jc w:val="center"/>
-            </w:pPr>
-            <w:r>
-              <w:rPr>
-                <w:sz w:val="20"/>
-              </w:rPr>
-              <w:t xml:space="preserve"> </w:t>
-            </w:r>
-          </w:p>
-        </w:tc>
-        <w:tc>
-          <w:tcPr>
-            <w:vAlign w:val="center"/>
-          </w:tcPr>
-          <w:p>
-            <w:pPr>
-              <w:pStyle w:val="Compact"/>
-              <w:jc w:val="center"/>
-            </w:pPr>
-            <w:r>
-              <w:rPr>
-                <w:sz w:val="20"/>
-              </w:rPr>
-              <w:t xml:space="preserve"> </w:t>
-            </w:r>
-          </w:p>
-        </w:tc>
-        <w:tc>
-          <w:tcPr>
-            <w:vAlign w:val="center"/>
-          </w:tcPr>
-          <w:p>
-            <w:pPr>
-              <w:pStyle w:val="Compact"/>
-              <w:jc w:val="center"/>
-            </w:pPr>
-            <w:r>
-              <w:rPr>
-                <w:sz w:val="20"/>
-              </w:rPr>
-              <w:t xml:space="preserve"> </w:t>
-            </w:r>
-          </w:p>
-        </w:tc>
-        <w:tc>
-          <w:tcPr>
-            <w:vAlign w:val="center"/>
-          </w:tcPr>
-          <w:p>
-            <w:pPr>
-              <w:pStyle w:val="Compact"/>
-              <w:jc w:val="center"/>
-            </w:pPr>
-            <w:r>
-              <w:rPr>
-                <w:sz w:val="20"/>
-              </w:rPr>
-              <w:t xml:space="preserve"> </w:t>
-            </w:r>
-          </w:p>
-        </w:tc>
-        <w:tc>
-          <w:tcPr>
-            <w:vAlign w:val="center"/>
-          </w:tcPr>
-          <w:p>
-            <w:pPr>
-              <w:pStyle w:val="Compact"/>
-              <w:jc w:val="center"/>
-            </w:pPr>
-            <w:r>
-              <w:rPr>
-                <w:sz w:val="20"/>
-              </w:rPr>
-              <w:t xml:space="preserve"> </w:t>
-            </w:r>
-          </w:p>
-        </w:tc>
-        <w:tc>
-          <w:tcPr>
-            <w:vAlign w:val="center"/>
-          </w:tcPr>
-          <w:p>
-            <w:pPr>
-              <w:pStyle w:val="Compact"/>
-              <w:jc w:val="center"/>
-            </w:pPr>
-            <w:r>
-              <w:rPr>
-                <w:sz w:val="20"/>
-              </w:rPr>
-              <w:t xml:space="preserve"> </w:t>
-            </w:r>
-          </w:p>
-        </w:tc>
-      </w:tr>
-      <w:tr>
-        <w:trPr>
-          <w:trHeight w:val="425" w:hRule="atLeast"/>
-        </w:trPr>
-        <w:tc>
-          <w:tcPr>
-            <w:vAlign w:val="center"/>
-          </w:tcPr>
-          <w:p>
-            <w:pPr>
-              <w:pStyle w:val="Compact"/>
-              <w:jc w:val="center"/>
-            </w:pPr>
-            <w:r>
-              <w:rPr>
-                <w:sz w:val="20"/>
-              </w:rPr>
-              <w:t xml:space="preserve">12</w:t>
-            </w:r>
-          </w:p>
-        </w:tc>
-        <w:tc>
-          <w:tcPr>
-            <w:vAlign w:val="center"/>
-          </w:tcPr>
-          <w:p>
-            <w:pPr>
-              <w:pStyle w:val="Compact"/>
-              <w:jc w:val="center"/>
-            </w:pPr>
-            <w:r>
-              <w:rPr>
-                <w:sz w:val="20"/>
-              </w:rPr>
-              <w:t xml:space="preserve"> </w:t>
             </w:r>
           </w:p>
         </w:tc>
@@ -4253,23 +3663,6 @@
             </w:r>
           </w:p>
         </w:tc>
-        <w:tc>
-          <w:tcPr>
-            <w:vAlign w:val="center"/>
-          </w:tcPr>
-          <w:p>
-            <w:pPr>
-              <w:pStyle w:val="Compact"/>
-              <w:jc w:val="center"/>
-            </w:pPr>
-            <w:r>
-              <w:rPr>
-                <w:sz w:val="20"/>
-              </w:rPr>
-              <w:t xml:space="preserve"> </w:t>
-            </w:r>
-          </w:p>
-        </w:tc>
       </w:tr>
     </w:tbl>
     <w:bookmarkEnd w:id="31"/>
@@ -4323,12 +3716,12 @@
         <m:sSub>
           <m:e>
             <m:r>
-              <m:t>φ</m:t>
+              <m:t>x</m:t>
             </m:r>
           </m:e>
           <m:sub>
             <m:r>
-              <m:t>k</m:t>
+              <m:t>n</m:t>
             </m:r>
           </m:sub>
         </m:sSub>
@@ -4343,18 +3736,9 @@
         <w:t xml:space="preserve"> </w:t>
       </w:r>
       <m:oMath>
-        <m:sSub>
-          <m:e>
-            <m:r>
-              <m:t>t</m:t>
-            </m:r>
-          </m:e>
-          <m:sub>
-            <m:r>
-              <m:t>k</m:t>
-            </m:r>
-          </m:sub>
-        </m:sSub>
+        <m:r>
+          <m:t>n</m:t>
+        </m:r>
       </m:oMath>
       <w:r>
         <w:t xml:space="preserve"> </w:t>
@@ -4422,21 +3806,21 @@
         <w:t xml:space="preserve"> </w:t>
       </w:r>
       <w:r>
-        <w:t xml:space="preserve">Con la pendiente</w:t>
+        <w:t xml:space="preserve">De la pendiente de cada recta obtenga</w:t>
       </w:r>
       <w:r>
         <w:t xml:space="preserve"> </w:t>
       </w:r>
       <m:oMath>
         <m:r>
-          <m:t>a</m:t>
+          <m:t>δ</m:t>
         </m:r>
       </m:oMath>
       <w:r>
         <w:t xml:space="preserve"> </w:t>
       </w:r>
       <w:r>
-        <w:t xml:space="preserve">de cada recta, calcule</w:t>
+        <w:t xml:space="preserve">con su error. Calcule</w:t>
       </w:r>
       <w:r>
         <w:t xml:space="preserve"> </w:t>
@@ -4452,23 +3836,35 @@
           <m:t>=</m:t>
         </m:r>
         <m:r>
+          <m:t>2</m:t>
+        </m:r>
+        <m:r>
+          <m:t>δ</m:t>
+        </m:r>
+        <m:r>
           <m:rPr>
             <m:sty m:val="p"/>
           </m:rPr>
-          <m:t>−</m:t>
+          <m:t>/</m:t>
         </m:r>
-        <m:r>
-          <m:t>2</m:t>
-        </m:r>
-        <m:r>
-          <m:t>a</m:t>
-        </m:r>
+        <m:sSub>
+          <m:e>
+            <m:r>
+              <m:t>T</m:t>
+            </m:r>
+          </m:e>
+          <m:sub>
+            <m:r>
+              <m:t>0</m:t>
+            </m:r>
+          </m:sub>
+        </m:sSub>
       </m:oMath>
       <w:r>
         <w:t xml:space="preserve"> </w:t>
       </w:r>
       <w:r>
-        <w:t xml:space="preserve">con su error y el factor de calidad</w:t>
+        <w:t xml:space="preserve">y</w:t>
       </w:r>
       <w:r>
         <w:t xml:space="preserve"> </w:t>
@@ -4517,7 +3913,7 @@
         <w:jc w:val="center"/>
       </w:pPr>
       <w:r>
-        <w:t xml:space="preserve">Tabla 3. Ritmo de amortiguamiento y factor de calidad.</w:t>
+        <w:t xml:space="preserve">Tabla 3. Decremento logarítmico, ritmo de amortiguamiento y factor de calidad.</w:t>
       </w:r>
     </w:p>
     <w:tbl>
@@ -4533,7 +3929,7 @@
           <w:insideV w:val="single" w:sz="6" w:color="000000"/>
         </w:tblBorders>
         <w:tblLook w:firstRow="1" w:lastRow="0" w:firstColumn="0" w:lastColumn="0" w:noHBand="0" w:noVBand="0" w:val="0020"/>
-        <w:tblCaption w:val="Tabla 3. Ritmo de amortiguamiento y factor de calidad."/>
+        <w:tblCaption w:val="Tabla 3. Decremento logarítmico, ritmo de amortiguamiento y factor de calidad."/>
       </w:tblPr>
       <w:tblGrid>
         <w:gridCol w:w="1584"/>
@@ -4638,21 +4034,9 @@
             </w:pPr>
             <m:oMath>
               <m:r>
-                <m:t>a</m:t>
+                <m:t>δ</m:t>
               </m:r>
             </m:oMath>
-            <w:r>
-              <w:rPr>
-                <w:sz w:val="20"/>
-              </w:rPr>
-              <w:t xml:space="preserve"> </w:t>
-            </w:r>
-            <w:r>
-              <w:rPr>
-                <w:sz w:val="20"/>
-              </w:rPr>
-              <w:t xml:space="preserve">(s⁻¹)</w:t>
-            </w:r>
           </w:p>
         </w:tc>
         <w:tc>

</xml_diff>